<commit_message>
Add marketplace.json and plugin.json to all skill folders
Makes the Claude-skills repo a browsable marketplace in Claude Code.
Each of the 33 skill folders now has .claude-plugin/plugin.json with
name, description, category, and author. Root .claude-plugin/marketplace.json
lists all plugins grouped by category (deal-intelligence, analysis,
research, output, communication, development, meta).

The repo is registered as a local marketplace pointing at
~/.claude/skills/ which is already synced to this repo.

Co-Authored-By: Claude Sonnet 4.6 <noreply@anthropic.com>
</commit_message>
<xml_diff>
--- a/docs/Deal_Intelligence_Workflow_Reference.docx
+++ b/docs/Deal_Intelligence_Workflow_Reference.docx
@@ -18,12 +18,12 @@
           <w:sz w:val="52"/>
           <w:szCs w:val="52"/>
         </w:rPr>
-        <w:t xml:space="preserve">Deal Intelligence</w:t>
-      </w:r>
-    </w:p>
-    <w:p>
-      <w:pPr>
-        <w:spacing w:before="0" w:after="40"/>
+        <w:t>Deal Intelligence</w:t>
+      </w:r>
+    </w:p>
+    <w:p>
+      <w:pPr>
+        <w:spacing w:after="40"/>
       </w:pPr>
       <w:r>
         <w:rPr>
@@ -32,23 +32,68 @@
           <w:sz w:val="26"/>
           <w:szCs w:val="26"/>
         </w:rPr>
-        <w:t xml:space="preserve">Workflow Reference  |  7-Phase IC Memo Chain</w:t>
-      </w:r>
-    </w:p>
-    <w:p>
-      <w:pPr>
-        <w:spacing w:before="0" w:after="200"/>
-      </w:pPr>
-      <w:r>
-        <w:rPr>
-          <w:rFonts w:ascii="Wix Madefor Display" w:hAnsi="Wix Madefor Display" w:cs="Wix Madefor Display"/>
+        <w:t xml:space="preserve">Workflow </w:t>
+      </w:r>
+      <w:proofErr w:type="gramStart"/>
+      <w:r>
+        <w:rPr>
+          <w:rFonts w:ascii="Wix Madefor Display SemiBold" w:hAnsi="Wix Madefor Display SemiBold" w:cs="Wix Madefor Display SemiBold"/>
+          <w:color w:val="444444"/>
+          <w:sz w:val="26"/>
+          <w:szCs w:val="26"/>
+        </w:rPr>
+        <w:t>Reference  |</w:t>
+      </w:r>
+      <w:proofErr w:type="gramEnd"/>
+      <w:r>
+        <w:rPr>
+          <w:rFonts w:ascii="Wix Madefor Display SemiBold" w:hAnsi="Wix Madefor Display SemiBold" w:cs="Wix Madefor Display SemiBold"/>
+          <w:color w:val="444444"/>
+          <w:sz w:val="26"/>
+          <w:szCs w:val="26"/>
+        </w:rPr>
+        <w:t xml:space="preserve">  7-Phase IC Memo Chain</w:t>
+      </w:r>
+    </w:p>
+    <w:p>
+      <w:pPr>
+        <w:spacing w:after="200"/>
+      </w:pPr>
+      <w:proofErr w:type="gramStart"/>
+      <w:r>
+        <w:rPr>
           <w:i/>
           <w:iCs/>
           <w:color w:val="666666"/>
-          <w:sz w:val="18"/>
-          <w:szCs w:val="18"/>
-        </w:rPr>
-        <w:t xml:space="preserve">Pattern  ·  May 2026  ·  Internal Reference</w:t>
+        </w:rPr>
+        <w:t>Pattern  ·</w:t>
+      </w:r>
+      <w:proofErr w:type="gramEnd"/>
+      <w:r>
+        <w:rPr>
+          <w:i/>
+          <w:iCs/>
+          <w:color w:val="666666"/>
+        </w:rPr>
+        <w:t xml:space="preserve">  May </w:t>
+      </w:r>
+      <w:proofErr w:type="gramStart"/>
+      <w:r>
+        <w:rPr>
+          <w:i/>
+          <w:iCs/>
+          <w:color w:val="666666"/>
+        </w:rPr>
+        <w:t>2026  ·</w:t>
+      </w:r>
+      <w:proofErr w:type="gramEnd"/>
+      <w:r>
+        <w:rPr>
+          <w:i/>
+          <w:iCs/>
+          <w:color w:val="666666"/>
+        </w:rPr>
+        <w:t xml:space="preserve">  Internal Reference</w:t>
       </w:r>
     </w:p>
     <w:p>
@@ -73,6 +118,7 @@
           <w:bottom w:w="80" w:type="dxa"/>
           <w:right w:w="120" w:type="dxa"/>
         </w:tblCellMar>
+        <w:tblLook w:val="04A0" w:firstRow="1" w:lastRow="0" w:firstColumn="1" w:lastColumn="0" w:noHBand="0" w:noVBand="1"/>
       </w:tblPr>
       <w:tblGrid>
         <w:gridCol w:w="2200"/>
@@ -104,10 +150,8 @@
                 <w:b/>
                 <w:bCs/>
                 <w:color w:val="FFFFFF"/>
-                <w:sz w:val="18"/>
-                <w:szCs w:val="18"/>
               </w:rPr>
-              <w:t xml:space="preserve">Entry point</w:t>
+              <w:t>Entry point</w:t>
             </w:r>
           </w:p>
         </w:tc>
@@ -135,10 +179,8 @@
                 <w:b/>
                 <w:bCs/>
                 <w:color w:val="FFFFFF"/>
-                <w:sz w:val="18"/>
-                <w:szCs w:val="18"/>
               </w:rPr>
-              <w:t xml:space="preserve">When to use</w:t>
+              <w:t>When to use</w:t>
             </w:r>
           </w:p>
         </w:tc>
@@ -166,10 +208,8 @@
                 <w:b/>
                 <w:bCs/>
                 <w:color w:val="FFFFFF"/>
-                <w:sz w:val="18"/>
-                <w:szCs w:val="18"/>
               </w:rPr>
-              <w:t xml:space="preserve">What to say</w:t>
+              <w:t>What to say</w:t>
             </w:r>
           </w:p>
         </w:tc>
@@ -198,11 +238,8 @@
                 <w:rFonts w:ascii="Wix Madefor Display SemiBold" w:hAnsi="Wix Madefor Display SemiBold" w:cs="Wix Madefor Display SemiBold"/>
                 <w:b/>
                 <w:bCs/>
-                <w:color w:val="000000"/>
-                <w:sz w:val="18"/>
-                <w:szCs w:val="18"/>
               </w:rPr>
-              <w:t xml:space="preserve">Full workflow</w:t>
+              <w:t>Full workflow</w:t>
             </w:r>
           </w:p>
         </w:tc>
@@ -225,13 +262,7 @@
           </w:tcPr>
           <w:p>
             <w:r>
-              <w:rPr>
-                <w:rFonts w:ascii="Wix Madefor Display" w:hAnsi="Wix Madefor Display" w:cs="Wix Madefor Display"/>
-                <w:color w:val="000000"/>
-                <w:sz w:val="18"/>
-                <w:szCs w:val="18"/>
-              </w:rPr>
-              <w:t xml:space="preserve">New deal, starting from scratch with source material</w:t>
+              <w:t>New deal, starting from scratch with source material</w:t>
             </w:r>
           </w:p>
         </w:tc>
@@ -254,13 +285,7 @@
           </w:tcPr>
           <w:p>
             <w:r>
-              <w:rPr>
-                <w:rFonts w:ascii="Wix Madefor Display" w:hAnsi="Wix Madefor Display" w:cs="Wix Madefor Display"/>
-                <w:color w:val="000000"/>
-                <w:sz w:val="18"/>
-                <w:szCs w:val="18"/>
-              </w:rPr>
-              <w:t xml:space="preserve">"Run deal intelligence on [Company], deal type [PE buyout], thesis: [one sentence]"</w:t>
+              <w:t>"Run deal intelligence on [Company], deal type [PE buyout], thesis: [one sentence]"</w:t>
             </w:r>
           </w:p>
         </w:tc>
@@ -289,11 +314,8 @@
                 <w:rFonts w:ascii="Wix Madefor Display SemiBold" w:hAnsi="Wix Madefor Display SemiBold" w:cs="Wix Madefor Display SemiBold"/>
                 <w:b/>
                 <w:bCs/>
-                <w:color w:val="000000"/>
-                <w:sz w:val="18"/>
-                <w:szCs w:val="18"/>
               </w:rPr>
-              <w:t xml:space="preserve">Mid-deal</w:t>
+              <w:t>Mid-deal</w:t>
             </w:r>
           </w:p>
         </w:tc>
@@ -316,13 +338,7 @@
           </w:tcPr>
           <w:p>
             <w:r>
-              <w:rPr>
-                <w:rFonts w:ascii="Wix Madefor Display" w:hAnsi="Wix Madefor Display" w:cs="Wix Madefor Display"/>
-                <w:color w:val="000000"/>
-                <w:sz w:val="18"/>
-                <w:szCs w:val="18"/>
-              </w:rPr>
-              <w:t xml:space="preserve">Research done, need memo / quality passes</w:t>
+              <w:t>Research done, need memo / quality passes</w:t>
             </w:r>
           </w:p>
         </w:tc>
@@ -345,13 +361,15 @@
           </w:tcPr>
           <w:p>
             <w:r>
-              <w:rPr>
-                <w:rFonts w:ascii="Wix Madefor Display" w:hAnsi="Wix Madefor Display" w:cs="Wix Madefor Display"/>
-                <w:color w:val="000000"/>
-                <w:sz w:val="18"/>
-                <w:szCs w:val="18"/>
-              </w:rPr>
-              <w:t xml:space="preserve">"Write the IC memo for [Company]"  or jump to any phase directly</w:t>
+              <w:t>"Write the IC memo for [Company]</w:t>
+            </w:r>
+            <w:proofErr w:type="gramStart"/>
+            <w:r>
+              <w:t>"  or</w:t>
+            </w:r>
+            <w:proofErr w:type="gramEnd"/>
+            <w:r>
+              <w:t xml:space="preserve"> jump to any phase directly</w:t>
             </w:r>
           </w:p>
         </w:tc>
@@ -380,11 +398,8 @@
                 <w:rFonts w:ascii="Wix Madefor Display SemiBold" w:hAnsi="Wix Madefor Display SemiBold" w:cs="Wix Madefor Display SemiBold"/>
                 <w:b/>
                 <w:bCs/>
-                <w:color w:val="000000"/>
-                <w:sz w:val="18"/>
-                <w:szCs w:val="18"/>
               </w:rPr>
-              <w:t xml:space="preserve">Output only</w:t>
+              <w:t>Output only</w:t>
             </w:r>
           </w:p>
         </w:tc>
@@ -407,13 +422,7 @@
           </w:tcPr>
           <w:p>
             <w:r>
-              <w:rPr>
-                <w:rFonts w:ascii="Wix Madefor Display" w:hAnsi="Wix Madefor Display" w:cs="Wix Madefor Display"/>
-                <w:color w:val="000000"/>
-                <w:sz w:val="18"/>
-                <w:szCs w:val="18"/>
-              </w:rPr>
-              <w:t xml:space="preserve">Draft complete, need branded document</w:t>
+              <w:t>Draft complete, need branded document</w:t>
             </w:r>
           </w:p>
         </w:tc>
@@ -436,13 +445,15 @@
           </w:tcPr>
           <w:p>
             <w:r>
-              <w:rPr>
-                <w:rFonts w:ascii="Wix Madefor Display" w:hAnsi="Wix Madefor Display" w:cs="Wix Madefor Display"/>
-                <w:color w:val="000000"/>
-                <w:sz w:val="18"/>
-                <w:szCs w:val="18"/>
-              </w:rPr>
-              <w:t xml:space="preserve">"Create a Pattern memo for [Company]"  or  "Create an investment deck"</w:t>
+              <w:t>"Create a Pattern memo for [Company]</w:t>
+            </w:r>
+            <w:proofErr w:type="gramStart"/>
+            <w:r>
+              <w:t>"  or</w:t>
+            </w:r>
+            <w:proofErr w:type="gramEnd"/>
+            <w:r>
+              <w:t xml:space="preserve">  "Create an investment deck"</w:t>
             </w:r>
           </w:p>
         </w:tc>
@@ -475,11 +486,8 @@
           <w:rFonts w:ascii="Wix Madefor Display SemiBold" w:hAnsi="Wix Madefor Display SemiBold" w:cs="Wix Madefor Display SemiBold"/>
           <w:b/>
           <w:bCs/>
-          <w:color w:val="000000"/>
-          <w:sz w:val="18"/>
-          <w:szCs w:val="18"/>
-        </w:rPr>
-        <w:t xml:space="preserve">Run phases in sequence. Do not compress. Each gate must be met before proceeding.</w:t>
+        </w:rPr>
+        <w:t>Run phases in sequence. Do not compress. Each gate must be met before proceeding.</w:t>
       </w:r>
     </w:p>
     <w:p>
@@ -495,7 +503,31 @@
           <w:sz w:val="20"/>
           <w:szCs w:val="20"/>
         </w:rPr>
-        <w:t xml:space="preserve">Phase 0  —  Competitive Context</w:t>
+        <w:t xml:space="preserve">Phase </w:t>
+      </w:r>
+      <w:proofErr w:type="gramStart"/>
+      <w:r>
+        <w:rPr>
+          <w:rFonts w:ascii="Wix Madefor Display SemiBold" w:hAnsi="Wix Madefor Display SemiBold" w:cs="Wix Madefor Display SemiBold"/>
+          <w:b/>
+          <w:bCs/>
+          <w:color w:val="0F4761"/>
+          <w:sz w:val="20"/>
+          <w:szCs w:val="20"/>
+        </w:rPr>
+        <w:t>0  —</w:t>
+      </w:r>
+      <w:proofErr w:type="gramEnd"/>
+      <w:r>
+        <w:rPr>
+          <w:rFonts w:ascii="Wix Madefor Display SemiBold" w:hAnsi="Wix Madefor Display SemiBold" w:cs="Wix Madefor Display SemiBold"/>
+          <w:b/>
+          <w:bCs/>
+          <w:color w:val="0F4761"/>
+          <w:sz w:val="20"/>
+          <w:szCs w:val="20"/>
+        </w:rPr>
+        <w:t xml:space="preserve">  Competitive Context</w:t>
       </w:r>
     </w:p>
     <w:p>
@@ -503,30 +535,21 @@
         <w:spacing w:after="120"/>
       </w:pPr>
       <w:r>
-        <w:rPr>
-          <w:rFonts w:ascii="Wix Madefor Display" w:hAnsi="Wix Madefor Display" w:cs="Wix Madefor Display"/>
-          <w:color w:val="000000"/>
-          <w:sz w:val="18"/>
-          <w:szCs w:val="18"/>
-        </w:rPr>
-        <w:t xml:space="preserve">Skip if you have no landscape data. Only if you have a competitor list or spreadsheet.</w:t>
-      </w:r>
-    </w:p>
-    <w:p>
-      <w:pPr>
+        <w:t>Skip if you have no landscape data. Only if you have a competitor list or spreadsheet.</w:t>
+      </w:r>
+    </w:p>
+    <w:p>
+      <w:pPr>
+        <w:spacing w:after="60"/>
         <w:ind w:left="360"/>
-        <w:spacing w:after="60"/>
-      </w:pPr>
-      <w:r>
-        <w:rPr>
-          <w:rFonts w:ascii="Wix Madefor Display" w:hAnsi="Wix Madefor Display" w:cs="Wix Madefor Display"/>
+      </w:pPr>
+      <w:r>
+        <w:rPr>
           <w:i/>
           <w:iCs/>
           <w:color w:val="3A00FD"/>
-          <w:sz w:val="18"/>
-          <w:szCs w:val="18"/>
-        </w:rPr>
-        <w:t xml:space="preserve">“Build deliverable from this competitor sheet”</w:t>
+        </w:rPr>
+        <w:t>“Build deliverable from this competitor sheet”</w:t>
       </w:r>
     </w:p>
     <w:p>
@@ -539,38 +562,52 @@
         <w:spacing w:after="40"/>
       </w:pPr>
       <w:r>
-        <w:rPr>
-          <w:rFonts w:ascii="Wix Madefor Display" w:hAnsi="Wix Madefor Display" w:cs="Wix Madefor Display"/>
-          <w:color w:val="000000"/>
-          <w:sz w:val="18"/>
-          <w:szCs w:val="18"/>
-        </w:rPr>
-        <w:t xml:space="preserve">Skill: competitive-landscape-deliverable</w:t>
-      </w:r>
+        <w:t xml:space="preserve">Skill: </w:t>
+      </w:r>
+      <w:proofErr w:type="gramStart"/>
+      <w:r>
+        <w:t>competitive-landscape-deliverable</w:t>
+      </w:r>
+      <w:proofErr w:type="gramEnd"/>
     </w:p>
     <w:p>
       <w:pPr>
         <w:spacing w:before="80" w:after="100"/>
       </w:pPr>
+      <w:proofErr w:type="gramStart"/>
       <w:r>
         <w:rPr>
           <w:rFonts w:ascii="Wix Madefor Display SemiBold" w:hAnsi="Wix Madefor Display SemiBold" w:cs="Wix Madefor Display SemiBold"/>
           <w:b/>
           <w:bCs/>
           <w:color w:val="375623"/>
-          <w:sz w:val="18"/>
-          <w:szCs w:val="18"/>
-        </w:rPr>
-        <w:t xml:space="preserve">✔  Gate: </w:t>
-      </w:r>
-      <w:r>
-        <w:rPr>
-          <w:rFonts w:ascii="Wix Madefor Display" w:hAnsi="Wix Madefor Display" w:cs="Wix Madefor Display"/>
+        </w:rPr>
+        <w:t>✔</w:t>
+      </w:r>
+      <w:r>
+        <w:rPr>
+          <w:rFonts w:ascii="Wix Madefor Display SemiBold" w:hAnsi="Wix Madefor Display SemiBold" w:cs="Wix Madefor Display SemiBold"/>
+          <w:b/>
+          <w:bCs/>
           <w:color w:val="375623"/>
-          <w:sz w:val="18"/>
-          <w:szCs w:val="18"/>
-        </w:rPr>
-        <w:t xml:space="preserve">Landscape framing confirmed</w:t>
+        </w:rPr>
+        <w:t xml:space="preserve">  Gate</w:t>
+      </w:r>
+      <w:proofErr w:type="gramEnd"/>
+      <w:r>
+        <w:rPr>
+          <w:rFonts w:ascii="Wix Madefor Display SemiBold" w:hAnsi="Wix Madefor Display SemiBold" w:cs="Wix Madefor Display SemiBold"/>
+          <w:b/>
+          <w:bCs/>
+          <w:color w:val="375623"/>
+        </w:rPr>
+        <w:t xml:space="preserve">: </w:t>
+      </w:r>
+      <w:r>
+        <w:rPr>
+          <w:color w:val="375623"/>
+        </w:rPr>
+        <w:t>Landscape framing confirmed</w:t>
       </w:r>
     </w:p>
     <w:p>
@@ -586,24 +623,45 @@
           <w:sz w:val="20"/>
           <w:szCs w:val="20"/>
         </w:rPr>
-        <w:t xml:space="preserve">Phase 1  —  Intake &amp; Screen</w:t>
-      </w:r>
-    </w:p>
-    <w:p>
-      <w:pPr>
+        <w:t xml:space="preserve">Phase </w:t>
+      </w:r>
+      <w:proofErr w:type="gramStart"/>
+      <w:r>
+        <w:rPr>
+          <w:rFonts w:ascii="Wix Madefor Display SemiBold" w:hAnsi="Wix Madefor Display SemiBold" w:cs="Wix Madefor Display SemiBold"/>
+          <w:b/>
+          <w:bCs/>
+          <w:color w:val="0F4761"/>
+          <w:sz w:val="20"/>
+          <w:szCs w:val="20"/>
+        </w:rPr>
+        <w:t>1  —</w:t>
+      </w:r>
+      <w:proofErr w:type="gramEnd"/>
+      <w:r>
+        <w:rPr>
+          <w:rFonts w:ascii="Wix Madefor Display SemiBold" w:hAnsi="Wix Madefor Display SemiBold" w:cs="Wix Madefor Display SemiBold"/>
+          <w:b/>
+          <w:bCs/>
+          <w:color w:val="0F4761"/>
+          <w:sz w:val="20"/>
+          <w:szCs w:val="20"/>
+        </w:rPr>
+        <w:t xml:space="preserve">  Intake &amp; Screen</w:t>
+      </w:r>
+    </w:p>
+    <w:p>
+      <w:pPr>
+        <w:spacing w:after="60"/>
         <w:ind w:left="360"/>
-        <w:spacing w:after="60"/>
-      </w:pPr>
-      <w:r>
-        <w:rPr>
-          <w:rFonts w:ascii="Wix Madefor Display" w:hAnsi="Wix Madefor Display" w:cs="Wix Madefor Display"/>
+      </w:pPr>
+      <w:r>
+        <w:rPr>
           <w:i/>
           <w:iCs/>
           <w:color w:val="3A00FD"/>
-          <w:sz w:val="18"/>
-          <w:szCs w:val="18"/>
-        </w:rPr>
-        <w:t xml:space="preserve">“Screen this deal — [Company], [deal type]”</w:t>
+        </w:rPr>
+        <w:t>“Screen this deal — [Company], [deal type]”</w:t>
       </w:r>
     </w:p>
     <w:p>
@@ -616,13 +674,15 @@
         <w:spacing w:after="40"/>
       </w:pPr>
       <w:r>
-        <w:rPr>
-          <w:rFonts w:ascii="Wix Madefor Display" w:hAnsi="Wix Madefor Display" w:cs="Wix Madefor Display"/>
-          <w:color w:val="000000"/>
-          <w:sz w:val="18"/>
-          <w:szCs w:val="18"/>
-        </w:rPr>
-        <w:t xml:space="preserve">mckinsey-consultant — Six Screening Questions; Gates 1/2/3 scored; NTB registry scaffolded (5 columns, ≥5 candidate NTBs)</w:t>
+        <w:t xml:space="preserve">mckinsey-consultant — Six Screening Questions; Gates </w:t>
+      </w:r>
+      <w:proofErr w:type="gramStart"/>
+      <w:r>
+        <w:t>1/2/3 scored</w:t>
+      </w:r>
+      <w:proofErr w:type="gramEnd"/>
+      <w:r>
+        <w:t>; NTB registry scaffolded (5 columns, ≥5 candidate NTBs)</w:t>
       </w:r>
     </w:p>
     <w:p>
@@ -635,38 +695,61 @@
         <w:spacing w:after="40"/>
       </w:pPr>
       <w:r>
-        <w:rPr>
-          <w:rFonts w:ascii="Wix Madefor Display" w:hAnsi="Wix Madefor Display" w:cs="Wix Madefor Display"/>
-          <w:color w:val="000000"/>
-          <w:sz w:val="18"/>
-          <w:szCs w:val="18"/>
-        </w:rPr>
-        <w:t xml:space="preserve">diligence-ddr — tailored data room request list issued</w:t>
+        <w:t>diligence-ddr — tailored data room request list issued</w:t>
       </w:r>
     </w:p>
     <w:p>
       <w:pPr>
         <w:spacing w:before="80" w:after="100"/>
       </w:pPr>
+      <w:proofErr w:type="gramStart"/>
       <w:r>
         <w:rPr>
           <w:rFonts w:ascii="Wix Madefor Display SemiBold" w:hAnsi="Wix Madefor Display SemiBold" w:cs="Wix Madefor Display SemiBold"/>
           <w:b/>
           <w:bCs/>
           <w:color w:val="375623"/>
-          <w:sz w:val="18"/>
-          <w:szCs w:val="18"/>
-        </w:rPr>
-        <w:t xml:space="preserve">✔  Gate: </w:t>
-      </w:r>
-      <w:r>
-        <w:rPr>
-          <w:rFonts w:ascii="Wix Madefor Display" w:hAnsi="Wix Madefor Display" w:cs="Wix Madefor Display"/>
+        </w:rPr>
+        <w:t>✔</w:t>
+      </w:r>
+      <w:r>
+        <w:rPr>
+          <w:rFonts w:ascii="Wix Madefor Display SemiBold" w:hAnsi="Wix Madefor Display SemiBold" w:cs="Wix Madefor Display SemiBold"/>
+          <w:b/>
+          <w:bCs/>
           <w:color w:val="375623"/>
-          <w:sz w:val="18"/>
-          <w:szCs w:val="18"/>
-        </w:rPr>
-        <w:t xml:space="preserve">Gates 1/2/3 scored. NTB registry has ≥5 candidate NTBs. DDR issued.</w:t>
+        </w:rPr>
+        <w:t xml:space="preserve">  Gate</w:t>
+      </w:r>
+      <w:proofErr w:type="gramEnd"/>
+      <w:r>
+        <w:rPr>
+          <w:rFonts w:ascii="Wix Madefor Display SemiBold" w:hAnsi="Wix Madefor Display SemiBold" w:cs="Wix Madefor Display SemiBold"/>
+          <w:b/>
+          <w:bCs/>
+          <w:color w:val="375623"/>
+        </w:rPr>
+        <w:t xml:space="preserve">: </w:t>
+      </w:r>
+      <w:r>
+        <w:rPr>
+          <w:color w:val="375623"/>
+        </w:rPr>
+        <w:t xml:space="preserve">Gates </w:t>
+      </w:r>
+      <w:proofErr w:type="gramStart"/>
+      <w:r>
+        <w:rPr>
+          <w:color w:val="375623"/>
+        </w:rPr>
+        <w:t>1/2/3 scored</w:t>
+      </w:r>
+      <w:proofErr w:type="gramEnd"/>
+      <w:r>
+        <w:rPr>
+          <w:color w:val="375623"/>
+        </w:rPr>
+        <w:t>. NTB registry has ≥5 candidate NTBs. DDR issued.</w:t>
       </w:r>
     </w:p>
     <w:p>
@@ -682,75 +765,87 @@
           <w:sz w:val="20"/>
           <w:szCs w:val="20"/>
         </w:rPr>
-        <w:t xml:space="preserve">Phase 2  —  Market &amp; Competitive Evidence</w:t>
-      </w:r>
-    </w:p>
-    <w:p>
-      <w:pPr>
+        <w:t xml:space="preserve">Phase </w:t>
+      </w:r>
+      <w:proofErr w:type="gramStart"/>
+      <w:r>
+        <w:rPr>
+          <w:rFonts w:ascii="Wix Madefor Display SemiBold" w:hAnsi="Wix Madefor Display SemiBold" w:cs="Wix Madefor Display SemiBold"/>
+          <w:b/>
+          <w:bCs/>
+          <w:color w:val="0F4761"/>
+          <w:sz w:val="20"/>
+          <w:szCs w:val="20"/>
+        </w:rPr>
+        <w:t>2  —</w:t>
+      </w:r>
+      <w:proofErr w:type="gramEnd"/>
+      <w:r>
+        <w:rPr>
+          <w:rFonts w:ascii="Wix Madefor Display SemiBold" w:hAnsi="Wix Madefor Display SemiBold" w:cs="Wix Madefor Display SemiBold"/>
+          <w:b/>
+          <w:bCs/>
+          <w:color w:val="0F4761"/>
+          <w:sz w:val="20"/>
+          <w:szCs w:val="20"/>
+        </w:rPr>
+        <w:t xml:space="preserve">  Market &amp; Competitive Evidence</w:t>
+      </w:r>
+    </w:p>
+    <w:p>
+      <w:pPr>
+        <w:spacing w:after="60"/>
         <w:ind w:left="360"/>
-        <w:spacing w:after="60"/>
-      </w:pPr>
-      <w:r>
-        <w:rPr>
-          <w:rFonts w:ascii="Wix Madefor Display" w:hAnsi="Wix Madefor Display" w:cs="Wix Madefor Display"/>
+      </w:pPr>
+      <w:r>
+        <w:rPr>
           <w:i/>
           <w:iCs/>
           <w:color w:val="3A00FD"/>
-          <w:sz w:val="18"/>
-          <w:szCs w:val="18"/>
-        </w:rPr>
-        <w:t xml:space="preserve">“Run market research on [Company / market]”</w:t>
-      </w:r>
-    </w:p>
-    <w:p>
-      <w:pPr>
+        </w:rPr>
+        <w:t>“Run market research on [Company / market]”</w:t>
+      </w:r>
+    </w:p>
+    <w:p>
+      <w:pPr>
+        <w:spacing w:after="60"/>
         <w:ind w:left="360"/>
-        <w:spacing w:after="60"/>
-      </w:pPr>
-      <w:r>
-        <w:rPr>
-          <w:rFonts w:ascii="Wix Madefor Display" w:hAnsi="Wix Madefor Display" w:cs="Wix Madefor Display"/>
+      </w:pPr>
+      <w:r>
+        <w:rPr>
           <w:i/>
           <w:iCs/>
           <w:color w:val="3A00FD"/>
-          <w:sz w:val="18"/>
-          <w:szCs w:val="18"/>
-        </w:rPr>
-        <w:t xml:space="preserve">“What's the TAM for [market]”</w:t>
-      </w:r>
-    </w:p>
-    <w:p>
-      <w:pPr>
+        </w:rPr>
+        <w:t>“What's the TAM for [market]”</w:t>
+      </w:r>
+    </w:p>
+    <w:p>
+      <w:pPr>
+        <w:spacing w:after="60"/>
         <w:ind w:left="360"/>
-        <w:spacing w:after="60"/>
-      </w:pPr>
-      <w:r>
-        <w:rPr>
-          <w:rFonts w:ascii="Wix Madefor Display" w:hAnsi="Wix Madefor Display" w:cs="Wix Madefor Display"/>
+      </w:pPr>
+      <w:r>
+        <w:rPr>
           <w:i/>
           <w:iCs/>
           <w:color w:val="3A00FD"/>
-          <w:sz w:val="18"/>
-          <w:szCs w:val="18"/>
-        </w:rPr>
-        <w:t xml:space="preserve">“Assess the moat for [Company]”</w:t>
-      </w:r>
-    </w:p>
-    <w:p>
-      <w:pPr>
+        </w:rPr>
+        <w:t>“Assess the moat for [Company]”</w:t>
+      </w:r>
+    </w:p>
+    <w:p>
+      <w:pPr>
+        <w:spacing w:after="60"/>
         <w:ind w:left="360"/>
-        <w:spacing w:after="60"/>
-      </w:pPr>
-      <w:r>
-        <w:rPr>
-          <w:rFonts w:ascii="Wix Madefor Display" w:hAnsi="Wix Madefor Display" w:cs="Wix Madefor Display"/>
+      </w:pPr>
+      <w:r>
+        <w:rPr>
           <w:i/>
           <w:iCs/>
           <w:color w:val="3A00FD"/>
-          <w:sz w:val="18"/>
-          <w:szCs w:val="18"/>
-        </w:rPr>
-        <w:t xml:space="preserve">“Test the limits of this advantage”</w:t>
+        </w:rPr>
+        <w:t>“Test the limits of this advantage”</w:t>
       </w:r>
     </w:p>
     <w:p>
@@ -763,13 +858,7 @@
         <w:spacing w:after="40"/>
       </w:pPr>
       <w:r>
-        <w:rPr>
-          <w:rFonts w:ascii="Wix Madefor Display" w:hAnsi="Wix Madefor Display" w:cs="Wix Madefor Display"/>
-          <w:color w:val="000000"/>
-          <w:sz w:val="18"/>
-          <w:szCs w:val="18"/>
-        </w:rPr>
-        <w:t xml:space="preserve">market-research — full L4→L1 research pyramid</w:t>
+        <w:t>market-research — full L4→L1 research pyramid</w:t>
       </w:r>
     </w:p>
     <w:p>
@@ -782,13 +871,7 @@
         <w:spacing w:after="40"/>
       </w:pPr>
       <w:r>
-        <w:rPr>
-          <w:rFonts w:ascii="Wix Madefor Display" w:hAnsi="Wix Madefor Display" w:cs="Wix Madefor Display"/>
-          <w:color w:val="000000"/>
-          <w:sz w:val="18"/>
-          <w:szCs w:val="18"/>
-        </w:rPr>
-        <w:t xml:space="preserve">tam-sam-som-calculator — Gate 2 criterion 1 (market size)</w:t>
+        <w:t>tam-sam-som-calculator — Gate 2 criterion 1 (market size)</w:t>
       </w:r>
     </w:p>
     <w:p>
@@ -801,13 +884,7 @@
         <w:spacing w:after="40"/>
       </w:pPr>
       <w:r>
-        <w:rPr>
-          <w:rFonts w:ascii="Wix Madefor Display" w:hAnsi="Wix Madefor Display" w:cs="Wix Madefor Display"/>
-          <w:color w:val="000000"/>
-          <w:sz w:val="18"/>
-          <w:szCs w:val="18"/>
-        </w:rPr>
-        <w:t xml:space="preserve">competitive-moat-assessment — moat verdict per named competitor</w:t>
+        <w:t>competitive-moat-assessment — moat verdict per named competitor</w:t>
       </w:r>
     </w:p>
     <w:p>
@@ -820,38 +897,47 @@
         <w:spacing w:after="40"/>
       </w:pPr>
       <w:r>
-        <w:rPr>
-          <w:rFonts w:ascii="Wix Madefor Display" w:hAnsi="Wix Madefor Display" w:cs="Wix Madefor Display"/>
-          <w:color w:val="000000"/>
-          <w:sz w:val="18"/>
-          <w:szCs w:val="18"/>
-        </w:rPr>
-        <w:t xml:space="preserve">boundability — where the moat holds vs. degrades</w:t>
+        <w:t>boundability — where the moat holds vs. degrades</w:t>
       </w:r>
     </w:p>
     <w:p>
       <w:pPr>
         <w:spacing w:before="80" w:after="100"/>
       </w:pPr>
+      <w:proofErr w:type="gramStart"/>
       <w:r>
         <w:rPr>
           <w:rFonts w:ascii="Wix Madefor Display SemiBold" w:hAnsi="Wix Madefor Display SemiBold" w:cs="Wix Madefor Display SemiBold"/>
           <w:b/>
           <w:bCs/>
           <w:color w:val="375623"/>
-          <w:sz w:val="18"/>
-          <w:szCs w:val="18"/>
-        </w:rPr>
-        <w:t xml:space="preserve">✔  Gate: </w:t>
-      </w:r>
-      <w:r>
-        <w:rPr>
-          <w:rFonts w:ascii="Wix Madefor Display" w:hAnsi="Wix Madefor Display" w:cs="Wix Madefor Display"/>
+        </w:rPr>
+        <w:t>✔</w:t>
+      </w:r>
+      <w:r>
+        <w:rPr>
+          <w:rFonts w:ascii="Wix Madefor Display SemiBold" w:hAnsi="Wix Madefor Display SemiBold" w:cs="Wix Madefor Display SemiBold"/>
+          <w:b/>
+          <w:bCs/>
           <w:color w:val="375623"/>
-          <w:sz w:val="18"/>
-          <w:szCs w:val="18"/>
-        </w:rPr>
-        <w:t xml:space="preserve">Gate 2 all 12 criteria complete. Moat verdict issued. Each NTB has ≥6 evidence bullets.</w:t>
+        </w:rPr>
+        <w:t xml:space="preserve">  Gate</w:t>
+      </w:r>
+      <w:proofErr w:type="gramEnd"/>
+      <w:r>
+        <w:rPr>
+          <w:rFonts w:ascii="Wix Madefor Display SemiBold" w:hAnsi="Wix Madefor Display SemiBold" w:cs="Wix Madefor Display SemiBold"/>
+          <w:b/>
+          <w:bCs/>
+          <w:color w:val="375623"/>
+        </w:rPr>
+        <w:t xml:space="preserve">: </w:t>
+      </w:r>
+      <w:r>
+        <w:rPr>
+          <w:color w:val="375623"/>
+        </w:rPr>
+        <w:t>Gate 2 all 12 criteria complete. Moat verdict issued. Each NTB has ≥6 evidence bullets.</w:t>
       </w:r>
     </w:p>
     <w:p>
@@ -867,7 +953,31 @@
           <w:sz w:val="20"/>
           <w:szCs w:val="20"/>
         </w:rPr>
-        <w:t xml:space="preserve">Phase 3  —  Deep Diligence</w:t>
+        <w:t xml:space="preserve">Phase </w:t>
+      </w:r>
+      <w:proofErr w:type="gramStart"/>
+      <w:r>
+        <w:rPr>
+          <w:rFonts w:ascii="Wix Madefor Display SemiBold" w:hAnsi="Wix Madefor Display SemiBold" w:cs="Wix Madefor Display SemiBold"/>
+          <w:b/>
+          <w:bCs/>
+          <w:color w:val="0F4761"/>
+          <w:sz w:val="20"/>
+          <w:szCs w:val="20"/>
+        </w:rPr>
+        <w:t>3  —</w:t>
+      </w:r>
+      <w:proofErr w:type="gramEnd"/>
+      <w:r>
+        <w:rPr>
+          <w:rFonts w:ascii="Wix Madefor Display SemiBold" w:hAnsi="Wix Madefor Display SemiBold" w:cs="Wix Madefor Display SemiBold"/>
+          <w:b/>
+          <w:bCs/>
+          <w:color w:val="0F4761"/>
+          <w:sz w:val="20"/>
+          <w:szCs w:val="20"/>
+        </w:rPr>
+        <w:t xml:space="preserve">  Deep Diligence</w:t>
       </w:r>
     </w:p>
     <w:p>
@@ -880,10 +990,8 @@
           <w:b/>
           <w:bCs/>
           <w:color w:val="C00000"/>
-          <w:sz w:val="18"/>
-          <w:szCs w:val="18"/>
-        </w:rPr>
-        <w:t xml:space="preserve">This phase separates thin memos from IC-quality work. Run all five skills.</w:t>
+        </w:rPr>
+        <w:t>This phase separates thin memos from IC-quality work. Run all five skills.</w:t>
       </w:r>
     </w:p>
     <w:tbl>
@@ -903,6 +1011,7 @@
           <w:bottom w:w="80" w:type="dxa"/>
           <w:right w:w="120" w:type="dxa"/>
         </w:tblCellMar>
+        <w:tblLook w:val="04A0" w:firstRow="1" w:lastRow="0" w:firstColumn="1" w:lastColumn="0" w:noHBand="0" w:noVBand="1"/>
       </w:tblPr>
       <w:tblGrid>
         <w:gridCol w:w="3800"/>
@@ -934,10 +1043,8 @@
                 <w:b/>
                 <w:bCs/>
                 <w:color w:val="FFFFFF"/>
-                <w:sz w:val="18"/>
-                <w:szCs w:val="18"/>
               </w:rPr>
-              <w:t xml:space="preserve">Prompt</w:t>
+              <w:t>Prompt</w:t>
             </w:r>
           </w:p>
         </w:tc>
@@ -965,10 +1072,8 @@
                 <w:b/>
                 <w:bCs/>
                 <w:color w:val="FFFFFF"/>
-                <w:sz w:val="18"/>
-                <w:szCs w:val="18"/>
               </w:rPr>
-              <w:t xml:space="preserve">Skill</w:t>
+              <w:t>Skill</w:t>
             </w:r>
           </w:p>
         </w:tc>
@@ -996,10 +1101,8 @@
                 <w:b/>
                 <w:bCs/>
                 <w:color w:val="FFFFFF"/>
-                <w:sz w:val="18"/>
-                <w:szCs w:val="18"/>
               </w:rPr>
-              <w:t xml:space="preserve">Output</w:t>
+              <w:t>Output</w:t>
             </w:r>
           </w:p>
         </w:tc>
@@ -1024,13 +1127,7 @@
           </w:tcPr>
           <w:p>
             <w:r>
-              <w:rPr>
-                <w:rFonts w:ascii="Wix Madefor Display" w:hAnsi="Wix Madefor Display" w:cs="Wix Madefor Display"/>
-                <w:color w:val="000000"/>
-                <w:sz w:val="18"/>
-                <w:szCs w:val="18"/>
-              </w:rPr>
-              <w:t xml:space="preserve">"NTB diligence on [Company]"</w:t>
+              <w:t>"NTB diligence on [Company]"</w:t>
             </w:r>
           </w:p>
         </w:tc>
@@ -1057,11 +1154,8 @@
                 <w:rFonts w:ascii="Wix Madefor Display SemiBold" w:hAnsi="Wix Madefor Display SemiBold" w:cs="Wix Madefor Display SemiBold"/>
                 <w:b/>
                 <w:bCs/>
-                <w:color w:val="000000"/>
-                <w:sz w:val="18"/>
-                <w:szCs w:val="18"/>
               </w:rPr>
-              <w:t xml:space="preserve">ntb-diligence</w:t>
+              <w:t>ntb-diligence</w:t>
             </w:r>
           </w:p>
         </w:tc>
@@ -1084,13 +1178,7 @@
           </w:tcPr>
           <w:p>
             <w:r>
-              <w:rPr>
-                <w:rFonts w:ascii="Wix Madefor Display" w:hAnsi="Wix Madefor Display" w:cs="Wix Madefor Display"/>
-                <w:color w:val="000000"/>
-                <w:sz w:val="18"/>
-                <w:szCs w:val="18"/>
-              </w:rPr>
-              <w:t xml:space="preserve">4-phase NTB quality check; MOIC sum tolerance ±15%</w:t>
+              <w:t>4-phase NTB quality check; MOIC sum tolerance ±15%</w:t>
             </w:r>
           </w:p>
         </w:tc>
@@ -1115,13 +1203,8 @@
           </w:tcPr>
           <w:p>
             <w:r>
-              <w:rPr>
-                <w:rFonts w:ascii="Wix Madefor Display" w:hAnsi="Wix Madefor Display" w:cs="Wix Madefor Display"/>
-                <w:color w:val="000000"/>
-                <w:sz w:val="18"/>
-                <w:szCs w:val="18"/>
-              </w:rPr>
-              <w:t xml:space="preserve">"Build a driver tree for this thesis"</w:t>
+              <w:lastRenderedPageBreak/>
+              <w:t>"Build a driver tree for this thesis"</w:t>
             </w:r>
           </w:p>
         </w:tc>
@@ -1148,11 +1231,8 @@
                 <w:rFonts w:ascii="Wix Madefor Display SemiBold" w:hAnsi="Wix Madefor Display SemiBold" w:cs="Wix Madefor Display SemiBold"/>
                 <w:b/>
                 <w:bCs/>
-                <w:color w:val="000000"/>
-                <w:sz w:val="18"/>
-                <w:szCs w:val="18"/>
               </w:rPr>
-              <w:t xml:space="preserve">driver-tree</w:t>
+              <w:t>driver-tree</w:t>
             </w:r>
           </w:p>
         </w:tc>
@@ -1175,13 +1255,7 @@
           </w:tcPr>
           <w:p>
             <w:r>
-              <w:rPr>
-                <w:rFonts w:ascii="Wix Madefor Display" w:hAnsi="Wix Madefor Display" w:cs="Wix Madefor Display"/>
-                <w:color w:val="000000"/>
-                <w:sz w:val="18"/>
-                <w:szCs w:val="18"/>
-              </w:rPr>
-              <w:t xml:space="preserve">MECE causal tree mapped to NTBs and MOIC</w:t>
+              <w:t>MECE causal tree mapped to NTBs and MOIC</w:t>
             </w:r>
           </w:p>
         </w:tc>
@@ -1206,13 +1280,7 @@
           </w:tcPr>
           <w:p>
             <w:r>
-              <w:rPr>
-                <w:rFonts w:ascii="Wix Madefor Display" w:hAnsi="Wix Madefor Display" w:cs="Wix Madefor Display"/>
-                <w:color w:val="000000"/>
-                <w:sz w:val="18"/>
-                <w:szCs w:val="18"/>
-              </w:rPr>
-              <w:t xml:space="preserve">"Build financial model from this P&amp;L"</w:t>
+              <w:t>"Build financial model from this P&amp;L"</w:t>
             </w:r>
           </w:p>
         </w:tc>
@@ -1239,11 +1307,8 @@
                 <w:rFonts w:ascii="Wix Madefor Display SemiBold" w:hAnsi="Wix Madefor Display SemiBold" w:cs="Wix Madefor Display SemiBold"/>
                 <w:b/>
                 <w:bCs/>
-                <w:color w:val="000000"/>
-                <w:sz w:val="18"/>
-                <w:szCs w:val="18"/>
               </w:rPr>
-              <w:t xml:space="preserve">financial-model-builder</w:t>
+              <w:t>financial-model-builder</w:t>
             </w:r>
           </w:p>
         </w:tc>
@@ -1266,13 +1331,7 @@
           </w:tcPr>
           <w:p>
             <w:r>
-              <w:rPr>
-                <w:rFonts w:ascii="Wix Madefor Display" w:hAnsi="Wix Madefor Display" w:cs="Wix Madefor Display"/>
-                <w:color w:val="000000"/>
-                <w:sz w:val="18"/>
-                <w:szCs w:val="18"/>
-              </w:rPr>
-              <w:t xml:space="preserve">3-tab operating model from source P&amp;L</w:t>
+              <w:t>3-tab operating model from source P&amp;L</w:t>
             </w:r>
           </w:p>
         </w:tc>
@@ -1297,13 +1356,7 @@
           </w:tcPr>
           <w:p>
             <w:r>
-              <w:rPr>
-                <w:rFonts w:ascii="Wix Madefor Display" w:hAnsi="Wix Madefor Display" w:cs="Wix Madefor Display"/>
-                <w:color w:val="000000"/>
-                <w:sz w:val="18"/>
-                <w:szCs w:val="18"/>
-              </w:rPr>
-              <w:t xml:space="preserve">"Analyze these GTM metrics"</w:t>
+              <w:t>"Analyze these GTM metrics"</w:t>
             </w:r>
           </w:p>
         </w:tc>
@@ -1330,11 +1383,8 @@
                 <w:rFonts w:ascii="Wix Madefor Display SemiBold" w:hAnsi="Wix Madefor Display SemiBold" w:cs="Wix Madefor Display SemiBold"/>
                 <w:b/>
                 <w:bCs/>
-                <w:color w:val="000000"/>
-                <w:sz w:val="18"/>
-                <w:szCs w:val="18"/>
               </w:rPr>
-              <w:t xml:space="preserve">gtm-metrics-analyzer</w:t>
+              <w:t>gtm-metrics-analyzer</w:t>
             </w:r>
           </w:p>
         </w:tc>
@@ -1357,13 +1407,7 @@
           </w:tcPr>
           <w:p>
             <w:r>
-              <w:rPr>
-                <w:rFonts w:ascii="Wix Madefor Display" w:hAnsi="Wix Madefor Display" w:cs="Wix Madefor Display"/>
-                <w:color w:val="000000"/>
-                <w:sz w:val="18"/>
-                <w:szCs w:val="18"/>
-              </w:rPr>
-              <w:t xml:space="preserve">48 GTM metrics across 6 families</w:t>
+              <w:t>48 GTM metrics across 6 families</w:t>
             </w:r>
           </w:p>
         </w:tc>
@@ -1388,13 +1432,7 @@
           </w:tcPr>
           <w:p>
             <w:r>
-              <w:rPr>
-                <w:rFonts w:ascii="Wix Madefor Display" w:hAnsi="Wix Madefor Display" w:cs="Wix Madefor Display"/>
-                <w:color w:val="000000"/>
-                <w:sz w:val="18"/>
-                <w:szCs w:val="18"/>
-              </w:rPr>
-              <w:t xml:space="preserve">"Audit this management plan"</w:t>
+              <w:t>"Audit this management plan"</w:t>
             </w:r>
           </w:p>
         </w:tc>
@@ -1421,11 +1459,8 @@
                 <w:rFonts w:ascii="Wix Madefor Display SemiBold" w:hAnsi="Wix Madefor Display SemiBold" w:cs="Wix Madefor Display SemiBold"/>
                 <w:b/>
                 <w:bCs/>
-                <w:color w:val="000000"/>
-                <w:sz w:val="18"/>
-                <w:szCs w:val="18"/>
               </w:rPr>
-              <w:t xml:space="preserve">kpi-tree-builder</w:t>
+              <w:t>kpi-tree-builder</w:t>
             </w:r>
           </w:p>
         </w:tc>
@@ -1448,13 +1483,7 @@
           </w:tcPr>
           <w:p>
             <w:r>
-              <w:rPr>
-                <w:rFonts w:ascii="Wix Madefor Display" w:hAnsi="Wix Madefor Display" w:cs="Wix Madefor Display"/>
-                <w:color w:val="000000"/>
-                <w:sz w:val="18"/>
-                <w:szCs w:val="18"/>
-              </w:rPr>
-              <w:t xml:space="preserve">Management budget credibility assessment</w:t>
+              <w:t>Management budget credibility assessment</w:t>
             </w:r>
           </w:p>
         </w:tc>
@@ -1469,25 +1498,40 @@
       <w:pPr>
         <w:spacing w:before="80" w:after="100"/>
       </w:pPr>
+      <w:proofErr w:type="gramStart"/>
       <w:r>
         <w:rPr>
           <w:rFonts w:ascii="Wix Madefor Display SemiBold" w:hAnsi="Wix Madefor Display SemiBold" w:cs="Wix Madefor Display SemiBold"/>
           <w:b/>
           <w:bCs/>
           <w:color w:val="375623"/>
-          <w:sz w:val="18"/>
-          <w:szCs w:val="18"/>
-        </w:rPr>
-        <w:t xml:space="preserve">✔  Gate: </w:t>
-      </w:r>
-      <w:r>
-        <w:rPr>
-          <w:rFonts w:ascii="Wix Madefor Display" w:hAnsi="Wix Madefor Display" w:cs="Wix Madefor Display"/>
+        </w:rPr>
+        <w:t>✔</w:t>
+      </w:r>
+      <w:r>
+        <w:rPr>
+          <w:rFonts w:ascii="Wix Madefor Display SemiBold" w:hAnsi="Wix Madefor Display SemiBold" w:cs="Wix Madefor Display SemiBold"/>
+          <w:b/>
+          <w:bCs/>
           <w:color w:val="375623"/>
-          <w:sz w:val="18"/>
-          <w:szCs w:val="18"/>
-        </w:rPr>
-        <w:t xml:space="preserve">NTB alignment check complete. Model built. GTM workbook complete. Management plan assessed.</w:t>
+        </w:rPr>
+        <w:t xml:space="preserve">  Gate</w:t>
+      </w:r>
+      <w:proofErr w:type="gramEnd"/>
+      <w:r>
+        <w:rPr>
+          <w:rFonts w:ascii="Wix Madefor Display SemiBold" w:hAnsi="Wix Madefor Display SemiBold" w:cs="Wix Madefor Display SemiBold"/>
+          <w:b/>
+          <w:bCs/>
+          <w:color w:val="375623"/>
+        </w:rPr>
+        <w:t xml:space="preserve">: </w:t>
+      </w:r>
+      <w:r>
+        <w:rPr>
+          <w:color w:val="375623"/>
+        </w:rPr>
+        <w:t>NTB alignment check complete. Model built. GTM workbook complete. Management plan assessed.</w:t>
       </w:r>
     </w:p>
     <w:p>
@@ -1503,24 +1547,45 @@
           <w:sz w:val="20"/>
           <w:szCs w:val="20"/>
         </w:rPr>
-        <w:t xml:space="preserve">Phase 4  —  Draft IC Memo</w:t>
-      </w:r>
-    </w:p>
-    <w:p>
-      <w:pPr>
+        <w:t xml:space="preserve">Phase </w:t>
+      </w:r>
+      <w:proofErr w:type="gramStart"/>
+      <w:r>
+        <w:rPr>
+          <w:rFonts w:ascii="Wix Madefor Display SemiBold" w:hAnsi="Wix Madefor Display SemiBold" w:cs="Wix Madefor Display SemiBold"/>
+          <w:b/>
+          <w:bCs/>
+          <w:color w:val="0F4761"/>
+          <w:sz w:val="20"/>
+          <w:szCs w:val="20"/>
+        </w:rPr>
+        <w:t>4  —</w:t>
+      </w:r>
+      <w:proofErr w:type="gramEnd"/>
+      <w:r>
+        <w:rPr>
+          <w:rFonts w:ascii="Wix Madefor Display SemiBold" w:hAnsi="Wix Madefor Display SemiBold" w:cs="Wix Madefor Display SemiBold"/>
+          <w:b/>
+          <w:bCs/>
+          <w:color w:val="0F4761"/>
+          <w:sz w:val="20"/>
+          <w:szCs w:val="20"/>
+        </w:rPr>
+        <w:t xml:space="preserve">  Draft IC Memo</w:t>
+      </w:r>
+    </w:p>
+    <w:p>
+      <w:pPr>
+        <w:spacing w:after="60"/>
         <w:ind w:left="360"/>
-        <w:spacing w:after="60"/>
-      </w:pPr>
-      <w:r>
-        <w:rPr>
-          <w:rFonts w:ascii="Wix Madefor Display" w:hAnsi="Wix Madefor Display" w:cs="Wix Madefor Display"/>
+      </w:pPr>
+      <w:r>
+        <w:rPr>
           <w:i/>
           <w:iCs/>
           <w:color w:val="3A00FD"/>
-          <w:sz w:val="18"/>
-          <w:szCs w:val="18"/>
-        </w:rPr>
-        <w:t xml:space="preserve">“Write the IC memo for [Company]”</w:t>
+        </w:rPr>
+        <w:t>“Write the IC memo for [Company]”</w:t>
       </w:r>
     </w:p>
     <w:p>
@@ -1533,13 +1598,7 @@
         <w:spacing w:after="40"/>
       </w:pPr>
       <w:r>
-        <w:rPr>
-          <w:rFonts w:ascii="Wix Madefor Display" w:hAnsi="Wix Madefor Display" w:cs="Wix Madefor Display"/>
-          <w:color w:val="000000"/>
-          <w:sz w:val="18"/>
-          <w:szCs w:val="18"/>
-        </w:rPr>
-        <w:t xml:space="preserve">ic-memo — 10-section structure</w:t>
+        <w:t>ic-memo — 10-section structure</w:t>
       </w:r>
     </w:p>
     <w:p>
@@ -1552,13 +1611,7 @@
         <w:spacing w:after="40"/>
       </w:pPr>
       <w:r>
-        <w:rPr>
-          <w:rFonts w:ascii="Wix Madefor Display" w:hAnsi="Wix Madefor Display" w:cs="Wix Madefor Display"/>
-          <w:color w:val="000000"/>
-          <w:sz w:val="18"/>
-          <w:szCs w:val="18"/>
-        </w:rPr>
-        <w:t xml:space="preserve">writing-style runs automatically on all prose before any document is written</w:t>
+        <w:t>writing-style runs automatically on all prose before any document is written</w:t>
       </w:r>
     </w:p>
     <w:p>
@@ -1566,13 +1619,7 @@
         <w:spacing w:after="40"/>
       </w:pPr>
       <w:r>
-        <w:rPr>
-          <w:rFonts w:ascii="Wix Madefor Display" w:hAnsi="Wix Madefor Display" w:cs="Wix Madefor Display"/>
-          <w:color w:val="000000"/>
-          <w:sz w:val="18"/>
-          <w:szCs w:val="18"/>
-        </w:rPr>
-        <w:t xml:space="preserve">10-section structure includes:</w:t>
+        <w:t>10-section structure includes:</w:t>
       </w:r>
     </w:p>
     <w:p>
@@ -1585,13 +1632,7 @@
         <w:spacing w:after="40"/>
       </w:pPr>
       <w:r>
-        <w:rPr>
-          <w:rFonts w:ascii="Wix Madefor Display" w:hAnsi="Wix Madefor Display" w:cs="Wix Madefor Display"/>
-          <w:color w:val="000000"/>
-          <w:sz w:val="18"/>
-          <w:szCs w:val="18"/>
-        </w:rPr>
-        <w:t xml:space="preserve">Executive summary with NTB registry — 5 columns, GAP items flagged</w:t>
+        <w:t>Executive summary with NTB registry — 5 columns, GAP items flagged</w:t>
       </w:r>
     </w:p>
     <w:p>
@@ -1604,13 +1645,7 @@
         <w:spacing w:after="40"/>
       </w:pPr>
       <w:r>
-        <w:rPr>
-          <w:rFonts w:ascii="Wix Madefor Display" w:hAnsi="Wix Madefor Display" w:cs="Wix Madefor Display"/>
-          <w:color w:val="000000"/>
-          <w:sz w:val="18"/>
-          <w:szCs w:val="18"/>
-        </w:rPr>
-        <w:t xml:space="preserve">Gate 2 12-criterion scorecard in market analysis section</w:t>
+        <w:t>Gate 2 12-criterion scorecard in market analysis section</w:t>
       </w:r>
     </w:p>
     <w:p>
@@ -1623,13 +1658,7 @@
         <w:spacing w:after="40"/>
       </w:pPr>
       <w:r>
-        <w:rPr>
-          <w:rFonts w:ascii="Wix Madefor Display" w:hAnsi="Wix Madefor Display" w:cs="Wix Madefor Display"/>
-          <w:color w:val="000000"/>
-          <w:sz w:val="18"/>
-          <w:szCs w:val="18"/>
-        </w:rPr>
-        <w:t xml:space="preserve">5-point NTB-structured investment thesis (Section 4)</w:t>
+        <w:t>5-point NTB-structured investment thesis (Section 4)</w:t>
       </w:r>
     </w:p>
     <w:p>
@@ -1642,13 +1671,7 @@
         <w:spacing w:after="40"/>
       </w:pPr>
       <w:r>
-        <w:rPr>
-          <w:rFonts w:ascii="Wix Madefor Display" w:hAnsi="Wix Madefor Display" w:cs="Wix Madefor Display"/>
-          <w:color w:val="000000"/>
-          <w:sz w:val="18"/>
-          <w:szCs w:val="18"/>
-        </w:rPr>
-        <w:t xml:space="preserve">Disaggregation table with MOIC delta columns</w:t>
+        <w:t>Disaggregation table with MOIC delta columns</w:t>
       </w:r>
     </w:p>
     <w:p>
@@ -1661,38 +1684,47 @@
         <w:spacing w:after="40"/>
       </w:pPr>
       <w:r>
-        <w:rPr>
-          <w:rFonts w:ascii="Wix Madefor Display" w:hAnsi="Wix Madefor Display" w:cs="Wix Madefor Display"/>
-          <w:color w:val="000000"/>
-          <w:sz w:val="18"/>
-          <w:szCs w:val="18"/>
-        </w:rPr>
-        <w:t xml:space="preserve">Information gaps table ranked by priority</w:t>
+        <w:t>Information gaps table ranked by priority</w:t>
       </w:r>
     </w:p>
     <w:p>
       <w:pPr>
         <w:spacing w:before="80" w:after="100"/>
       </w:pPr>
+      <w:proofErr w:type="gramStart"/>
       <w:r>
         <w:rPr>
           <w:rFonts w:ascii="Wix Madefor Display SemiBold" w:hAnsi="Wix Madefor Display SemiBold" w:cs="Wix Madefor Display SemiBold"/>
           <w:b/>
           <w:bCs/>
           <w:color w:val="375623"/>
-          <w:sz w:val="18"/>
-          <w:szCs w:val="18"/>
-        </w:rPr>
-        <w:t xml:space="preserve">✔  Gate: </w:t>
-      </w:r>
-      <w:r>
-        <w:rPr>
-          <w:rFonts w:ascii="Wix Madefor Display" w:hAnsi="Wix Madefor Display" w:cs="Wix Madefor Display"/>
+        </w:rPr>
+        <w:t>✔</w:t>
+      </w:r>
+      <w:r>
+        <w:rPr>
+          <w:rFonts w:ascii="Wix Madefor Display SemiBold" w:hAnsi="Wix Madefor Display SemiBold" w:cs="Wix Madefor Display SemiBold"/>
+          <w:b/>
+          <w:bCs/>
           <w:color w:val="375623"/>
-          <w:sz w:val="18"/>
-          <w:szCs w:val="18"/>
-        </w:rPr>
-        <w:t xml:space="preserve">Full 10-section draft. All claims tagged [F] fact / [E] estimate / [H] hypothesis.</w:t>
+        </w:rPr>
+        <w:t xml:space="preserve">  Gate</w:t>
+      </w:r>
+      <w:proofErr w:type="gramEnd"/>
+      <w:r>
+        <w:rPr>
+          <w:rFonts w:ascii="Wix Madefor Display SemiBold" w:hAnsi="Wix Madefor Display SemiBold" w:cs="Wix Madefor Display SemiBold"/>
+          <w:b/>
+          <w:bCs/>
+          <w:color w:val="375623"/>
+        </w:rPr>
+        <w:t xml:space="preserve">: </w:t>
+      </w:r>
+      <w:r>
+        <w:rPr>
+          <w:color w:val="375623"/>
+        </w:rPr>
+        <w:t>Full 10-section draft. All claims tagged [F] fact / [E] estimate / [H] hypothesis.</w:t>
       </w:r>
     </w:p>
     <w:p>
@@ -1708,23 +1740,44 @@
           <w:sz w:val="20"/>
           <w:szCs w:val="20"/>
         </w:rPr>
-        <w:t xml:space="preserve">Phase 5  —  Quality Passes</w:t>
-      </w:r>
-    </w:p>
-    <w:p>
-      <w:pPr>
-        <w:spacing w:after="120"/>
-      </w:pPr>
+        <w:t xml:space="preserve">Phase </w:t>
+      </w:r>
+      <w:proofErr w:type="gramStart"/>
       <w:r>
         <w:rPr>
           <w:rFonts w:ascii="Wix Madefor Display SemiBold" w:hAnsi="Wix Madefor Display SemiBold" w:cs="Wix Madefor Display SemiBold"/>
           <w:b/>
           <w:bCs/>
-          <w:color w:val="000000"/>
-          <w:sz w:val="18"/>
-          <w:szCs w:val="18"/>
-        </w:rPr>
-        <w:t xml:space="preserve">Run all three in sequence. Do not compress into one pass.</w:t>
+          <w:color w:val="0F4761"/>
+          <w:sz w:val="20"/>
+          <w:szCs w:val="20"/>
+        </w:rPr>
+        <w:t>5  —</w:t>
+      </w:r>
+      <w:proofErr w:type="gramEnd"/>
+      <w:r>
+        <w:rPr>
+          <w:rFonts w:ascii="Wix Madefor Display SemiBold" w:hAnsi="Wix Madefor Display SemiBold" w:cs="Wix Madefor Display SemiBold"/>
+          <w:b/>
+          <w:bCs/>
+          <w:color w:val="0F4761"/>
+          <w:sz w:val="20"/>
+          <w:szCs w:val="20"/>
+        </w:rPr>
+        <w:t xml:space="preserve">  Quality Passes</w:t>
+      </w:r>
+    </w:p>
+    <w:p>
+      <w:pPr>
+        <w:spacing w:after="120"/>
+      </w:pPr>
+      <w:r>
+        <w:rPr>
+          <w:rFonts w:ascii="Wix Madefor Display SemiBold" w:hAnsi="Wix Madefor Display SemiBold" w:cs="Wix Madefor Display SemiBold"/>
+          <w:b/>
+          <w:bCs/>
+        </w:rPr>
+        <w:t>Run all three in sequence. Do not compress into one pass.</w:t>
       </w:r>
     </w:p>
     <w:tbl>
@@ -1744,6 +1797,7 @@
           <w:bottom w:w="80" w:type="dxa"/>
           <w:right w:w="120" w:type="dxa"/>
         </w:tblCellMar>
+        <w:tblLook w:val="04A0" w:firstRow="1" w:lastRow="0" w:firstColumn="1" w:lastColumn="0" w:noHBand="0" w:noVBand="1"/>
       </w:tblPr>
       <w:tblGrid>
         <w:gridCol w:w="3200"/>
@@ -1775,10 +1829,8 @@
                 <w:b/>
                 <w:bCs/>
                 <w:color w:val="FFFFFF"/>
-                <w:sz w:val="18"/>
-                <w:szCs w:val="18"/>
               </w:rPr>
-              <w:t xml:space="preserve">Prompt</w:t>
+              <w:t>Prompt</w:t>
             </w:r>
           </w:p>
         </w:tc>
@@ -1806,10 +1858,8 @@
                 <w:b/>
                 <w:bCs/>
                 <w:color w:val="FFFFFF"/>
-                <w:sz w:val="18"/>
-                <w:szCs w:val="18"/>
               </w:rPr>
-              <w:t xml:space="preserve">Skill</w:t>
+              <w:t>Skill</w:t>
             </w:r>
           </w:p>
         </w:tc>
@@ -1837,10 +1887,8 @@
                 <w:b/>
                 <w:bCs/>
                 <w:color w:val="FFFFFF"/>
-                <w:sz w:val="18"/>
-                <w:szCs w:val="18"/>
               </w:rPr>
-              <w:t xml:space="preserve">What it catches</w:t>
+              <w:t>What it catches</w:t>
             </w:r>
           </w:p>
         </w:tc>
@@ -1865,13 +1913,7 @@
           </w:tcPr>
           <w:p>
             <w:r>
-              <w:rPr>
-                <w:rFonts w:ascii="Wix Madefor Display" w:hAnsi="Wix Madefor Display" w:cs="Wix Madefor Display"/>
-                <w:color w:val="000000"/>
-                <w:sz w:val="18"/>
-                <w:szCs w:val="18"/>
-              </w:rPr>
-              <w:t xml:space="preserve">"Claim-scrutinize this memo"</w:t>
+              <w:t>"Claim-scrutinize this memo"</w:t>
             </w:r>
           </w:p>
         </w:tc>
@@ -1898,11 +1940,8 @@
                 <w:rFonts w:ascii="Wix Madefor Display SemiBold" w:hAnsi="Wix Madefor Display SemiBold" w:cs="Wix Madefor Display SemiBold"/>
                 <w:b/>
                 <w:bCs/>
-                <w:color w:val="000000"/>
-                <w:sz w:val="18"/>
-                <w:szCs w:val="18"/>
               </w:rPr>
-              <w:t xml:space="preserve">claim-scrutinizer</w:t>
+              <w:t>claim-scrutinizer</w:t>
             </w:r>
           </w:p>
         </w:tc>
@@ -1925,13 +1964,7 @@
           </w:tcPr>
           <w:p>
             <w:r>
-              <w:rPr>
-                <w:rFonts w:ascii="Wix Madefor Display" w:hAnsi="Wix Madefor Display" w:cs="Wix Madefor Display"/>
-                <w:color w:val="000000"/>
-                <w:sz w:val="18"/>
-                <w:szCs w:val="18"/>
-              </w:rPr>
-              <w:t xml:space="preserve">Structure gaps, unsupported claims, Gate 2 classification errors</w:t>
+              <w:t>Structure gaps, unsupported claims, Gate 2 classification errors</w:t>
             </w:r>
           </w:p>
         </w:tc>
@@ -1956,13 +1989,7 @@
           </w:tcPr>
           <w:p>
             <w:r>
-              <w:rPr>
-                <w:rFonts w:ascii="Wix Madefor Display" w:hAnsi="Wix Madefor Display" w:cs="Wix Madefor Display"/>
-                <w:color w:val="000000"/>
-                <w:sz w:val="18"/>
-                <w:szCs w:val="18"/>
-              </w:rPr>
-              <w:t xml:space="preserve">"Red team this thesis"</w:t>
+              <w:t>"Red team this thesis"</w:t>
             </w:r>
           </w:p>
         </w:tc>
@@ -1984,17 +2011,16 @@
             </w:tcMar>
           </w:tcPr>
           <w:p>
+            <w:proofErr w:type="gramStart"/>
             <w:r>
               <w:rPr>
                 <w:rFonts w:ascii="Wix Madefor Display SemiBold" w:hAnsi="Wix Madefor Display SemiBold" w:cs="Wix Madefor Display SemiBold"/>
                 <w:b/>
                 <w:bCs/>
-                <w:color w:val="000000"/>
-                <w:sz w:val="18"/>
-                <w:szCs w:val="18"/>
               </w:rPr>
-              <w:t xml:space="preserve">red-team</w:t>
-            </w:r>
+              <w:t>red-team</w:t>
+            </w:r>
+            <w:proofErr w:type="gramEnd"/>
           </w:p>
         </w:tc>
         <w:tc>
@@ -2016,13 +2042,7 @@
           </w:tcPr>
           <w:p>
             <w:r>
-              <w:rPr>
-                <w:rFonts w:ascii="Wix Madefor Display" w:hAnsi="Wix Madefor Display" w:cs="Wix Madefor Display"/>
-                <w:color w:val="000000"/>
-                <w:sz w:val="18"/>
-                <w:szCs w:val="18"/>
-              </w:rPr>
-              <w:t xml:space="preserve">Investment attack lenses. KILL-rated claims must be hardened before Phase 6</w:t>
+              <w:t>Investment attack lenses. KILL-rated claims must be hardened before Phase 6</w:t>
             </w:r>
           </w:p>
         </w:tc>
@@ -2047,13 +2067,7 @@
           </w:tcPr>
           <w:p>
             <w:r>
-              <w:rPr>
-                <w:rFonts w:ascii="Wix Madefor Display" w:hAnsi="Wix Madefor Display" w:cs="Wix Madefor Display"/>
-                <w:color w:val="000000"/>
-                <w:sz w:val="18"/>
-                <w:szCs w:val="18"/>
-              </w:rPr>
-              <w:t xml:space="preserve">"Pre-mortem this deal"</w:t>
+              <w:t>"Pre-mortem this deal"</w:t>
             </w:r>
           </w:p>
         </w:tc>
@@ -2080,11 +2094,8 @@
                 <w:rFonts w:ascii="Wix Madefor Display SemiBold" w:hAnsi="Wix Madefor Display SemiBold" w:cs="Wix Madefor Display SemiBold"/>
                 <w:b/>
                 <w:bCs/>
-                <w:color w:val="000000"/>
-                <w:sz w:val="18"/>
-                <w:szCs w:val="18"/>
               </w:rPr>
-              <w:t xml:space="preserve">pre-mortem</w:t>
+              <w:t>pre-mortem</w:t>
             </w:r>
           </w:p>
         </w:tc>
@@ -2107,13 +2118,7 @@
           </w:tcPr>
           <w:p>
             <w:r>
-              <w:rPr>
-                <w:rFonts w:ascii="Wix Madefor Display" w:hAnsi="Wix Madefor Display" w:cs="Wix Madefor Display"/>
-                <w:color w:val="000000"/>
-                <w:sz w:val="18"/>
-                <w:szCs w:val="18"/>
-              </w:rPr>
-              <w:t xml:space="preserve">Failure modes mapped to NTBs; compound failure paths; IC-facing risk narrative</w:t>
+              <w:t>Failure modes mapped to NTBs; compound failure paths; IC-facing risk narrative</w:t>
             </w:r>
           </w:p>
         </w:tc>
@@ -2128,25 +2133,52 @@
       <w:pPr>
         <w:spacing w:before="80" w:after="100"/>
       </w:pPr>
+      <w:proofErr w:type="gramStart"/>
       <w:r>
         <w:rPr>
           <w:rFonts w:ascii="Wix Madefor Display SemiBold" w:hAnsi="Wix Madefor Display SemiBold" w:cs="Wix Madefor Display SemiBold"/>
           <w:b/>
           <w:bCs/>
           <w:color w:val="375623"/>
-          <w:sz w:val="18"/>
-          <w:szCs w:val="18"/>
-        </w:rPr>
-        <w:t xml:space="preserve">✔  Gate: </w:t>
-      </w:r>
-      <w:r>
-        <w:rPr>
-          <w:rFonts w:ascii="Wix Madefor Display" w:hAnsi="Wix Madefor Display" w:cs="Wix Madefor Display"/>
+        </w:rPr>
+        <w:t>✔</w:t>
+      </w:r>
+      <w:r>
+        <w:rPr>
+          <w:rFonts w:ascii="Wix Madefor Display SemiBold" w:hAnsi="Wix Madefor Display SemiBold" w:cs="Wix Madefor Display SemiBold"/>
+          <w:b/>
+          <w:bCs/>
           <w:color w:val="375623"/>
-          <w:sz w:val="18"/>
-          <w:szCs w:val="18"/>
-        </w:rPr>
-        <w:t xml:space="preserve">All 🔴 CRITICAL issues resolved. KILL claims hardened. Section 7 (risks) updated.</w:t>
+        </w:rPr>
+        <w:t xml:space="preserve">  Gate</w:t>
+      </w:r>
+      <w:proofErr w:type="gramEnd"/>
+      <w:r>
+        <w:rPr>
+          <w:rFonts w:ascii="Wix Madefor Display SemiBold" w:hAnsi="Wix Madefor Display SemiBold" w:cs="Wix Madefor Display SemiBold"/>
+          <w:b/>
+          <w:bCs/>
+          <w:color w:val="375623"/>
+        </w:rPr>
+        <w:t xml:space="preserve">: </w:t>
+      </w:r>
+      <w:r>
+        <w:rPr>
+          <w:color w:val="375623"/>
+        </w:rPr>
+        <w:t xml:space="preserve">All </w:t>
+      </w:r>
+      <w:r>
+        <w:rPr>
+          <w:color w:val="375623"/>
+        </w:rPr>
+        <w:t>🔴</w:t>
+      </w:r>
+      <w:r>
+        <w:rPr>
+          <w:color w:val="375623"/>
+        </w:rPr>
+        <w:t xml:space="preserve"> CRITICAL issues resolved. KILL claims hardened. Section 7 (risks) updated.</w:t>
       </w:r>
     </w:p>
     <w:p>
@@ -2162,58 +2194,73 @@
           <w:sz w:val="20"/>
           <w:szCs w:val="20"/>
         </w:rPr>
-        <w:t xml:space="preserve">Phase 6  —  Output</w:t>
-      </w:r>
-    </w:p>
-    <w:p>
-      <w:pPr>
+        <w:t xml:space="preserve">Phase </w:t>
+      </w:r>
+      <w:proofErr w:type="gramStart"/>
+      <w:r>
+        <w:rPr>
+          <w:rFonts w:ascii="Wix Madefor Display SemiBold" w:hAnsi="Wix Madefor Display SemiBold" w:cs="Wix Madefor Display SemiBold"/>
+          <w:b/>
+          <w:bCs/>
+          <w:color w:val="0F4761"/>
+          <w:sz w:val="20"/>
+          <w:szCs w:val="20"/>
+        </w:rPr>
+        <w:t>6  —</w:t>
+      </w:r>
+      <w:proofErr w:type="gramEnd"/>
+      <w:r>
+        <w:rPr>
+          <w:rFonts w:ascii="Wix Madefor Display SemiBold" w:hAnsi="Wix Madefor Display SemiBold" w:cs="Wix Madefor Display SemiBold"/>
+          <w:b/>
+          <w:bCs/>
+          <w:color w:val="0F4761"/>
+          <w:sz w:val="20"/>
+          <w:szCs w:val="20"/>
+        </w:rPr>
+        <w:t xml:space="preserve">  Output</w:t>
+      </w:r>
+    </w:p>
+    <w:p>
+      <w:pPr>
+        <w:spacing w:after="60"/>
         <w:ind w:left="360"/>
-        <w:spacing w:after="60"/>
-      </w:pPr>
-      <w:r>
-        <w:rPr>
-          <w:rFonts w:ascii="Wix Madefor Display" w:hAnsi="Wix Madefor Display" w:cs="Wix Madefor Display"/>
+      </w:pPr>
+      <w:r>
+        <w:rPr>
           <w:i/>
           <w:iCs/>
           <w:color w:val="3A00FD"/>
-          <w:sz w:val="18"/>
-          <w:szCs w:val="18"/>
-        </w:rPr>
-        <w:t xml:space="preserve">“Create a Pattern memo for [Company]”</w:t>
-      </w:r>
-    </w:p>
-    <w:p>
-      <w:pPr>
+        </w:rPr>
+        <w:t>“Create a Pattern memo for [Company]”</w:t>
+      </w:r>
+    </w:p>
+    <w:p>
+      <w:pPr>
+        <w:spacing w:after="60"/>
         <w:ind w:left="360"/>
-        <w:spacing w:after="60"/>
-      </w:pPr>
-      <w:r>
-        <w:rPr>
-          <w:rFonts w:ascii="Wix Madefor Display" w:hAnsi="Wix Madefor Display" w:cs="Wix Madefor Display"/>
+      </w:pPr>
+      <w:r>
+        <w:rPr>
           <w:i/>
           <w:iCs/>
           <w:color w:val="3A00FD"/>
-          <w:sz w:val="18"/>
-          <w:szCs w:val="18"/>
-        </w:rPr>
-        <w:t xml:space="preserve">“Create an investment deck for [Company]”</w:t>
-      </w:r>
-    </w:p>
-    <w:p>
-      <w:pPr>
+        </w:rPr>
+        <w:t>“Create an investment deck for [Company]”</w:t>
+      </w:r>
+    </w:p>
+    <w:p>
+      <w:pPr>
+        <w:spacing w:after="60"/>
         <w:ind w:left="360"/>
-        <w:spacing w:after="60"/>
-      </w:pPr>
-      <w:r>
-        <w:rPr>
-          <w:rFonts w:ascii="Wix Madefor Display" w:hAnsi="Wix Madefor Display" w:cs="Wix Madefor Display"/>
+      </w:pPr>
+      <w:r>
+        <w:rPr>
           <w:i/>
           <w:iCs/>
           <w:color w:val="3A00FD"/>
-          <w:sz w:val="18"/>
-          <w:szCs w:val="18"/>
-        </w:rPr>
-        <w:t xml:space="preserve">“Write the executive summary”</w:t>
+        </w:rPr>
+        <w:t>“Write the executive summary”</w:t>
       </w:r>
     </w:p>
     <w:p>
@@ -2226,13 +2273,7 @@
         <w:spacing w:after="40"/>
       </w:pPr>
       <w:r>
-        <w:rPr>
-          <w:rFonts w:ascii="Wix Madefor Display" w:hAnsi="Wix Madefor Display" w:cs="Wix Madefor Display"/>
-          <w:color w:val="000000"/>
-          <w:sz w:val="18"/>
-          <w:szCs w:val="18"/>
-        </w:rPr>
-        <w:t xml:space="preserve">pattern-docx or pattern-investment-pptx — branded output</w:t>
+        <w:t>pattern-docx or pattern-investment-pptx — branded output</w:t>
       </w:r>
     </w:p>
     <w:p>
@@ -2245,13 +2286,13 @@
         <w:spacing w:after="40"/>
       </w:pPr>
       <w:r>
-        <w:rPr>
-          <w:rFonts w:ascii="Wix Madefor Display" w:hAnsi="Wix Madefor Display" w:cs="Wix Madefor Display"/>
-          <w:color w:val="000000"/>
-          <w:sz w:val="18"/>
-          <w:szCs w:val="18"/>
-        </w:rPr>
-        <w:t xml:space="preserve">doc-quality-checker — auto-runs; resolve all 🔴 CRITICAL issues before IC distribution</w:t>
+        <w:t xml:space="preserve">doc-quality-checker — auto-runs; resolve all </w:t>
+      </w:r>
+      <w:r>
+        <w:t>🔴</w:t>
+      </w:r>
+      <w:r>
+        <w:t xml:space="preserve"> CRITICAL issues before IC distribution</w:t>
       </w:r>
     </w:p>
     <w:p>
@@ -2264,38 +2305,59 @@
         <w:spacing w:after="40"/>
       </w:pPr>
       <w:r>
-        <w:rPr>
-          <w:rFonts w:ascii="Wix Madefor Display" w:hAnsi="Wix Madefor Display" w:cs="Wix Madefor Display"/>
-          <w:color w:val="000000"/>
-          <w:sz w:val="18"/>
-          <w:szCs w:val="18"/>
-        </w:rPr>
-        <w:t xml:space="preserve">executive-summary-writer — one-page distillation</w:t>
+        <w:t>executive-summary-writer — one-page distillation</w:t>
       </w:r>
     </w:p>
     <w:p>
       <w:pPr>
         <w:spacing w:before="80" w:after="100"/>
       </w:pPr>
+      <w:proofErr w:type="gramStart"/>
       <w:r>
         <w:rPr>
           <w:rFonts w:ascii="Wix Madefor Display SemiBold" w:hAnsi="Wix Madefor Display SemiBold" w:cs="Wix Madefor Display SemiBold"/>
           <w:b/>
           <w:bCs/>
           <w:color w:val="375623"/>
-          <w:sz w:val="18"/>
-          <w:szCs w:val="18"/>
-        </w:rPr>
-        <w:t xml:space="preserve">✔  Gate: </w:t>
-      </w:r>
-      <w:r>
-        <w:rPr>
-          <w:rFonts w:ascii="Wix Madefor Display" w:hAnsi="Wix Madefor Display" w:cs="Wix Madefor Display"/>
+        </w:rPr>
+        <w:t>✔</w:t>
+      </w:r>
+      <w:r>
+        <w:rPr>
+          <w:rFonts w:ascii="Wix Madefor Display SemiBold" w:hAnsi="Wix Madefor Display SemiBold" w:cs="Wix Madefor Display SemiBold"/>
+          <w:b/>
+          <w:bCs/>
           <w:color w:val="375623"/>
-          <w:sz w:val="18"/>
-          <w:szCs w:val="18"/>
-        </w:rPr>
-        <w:t xml:space="preserve">Zero 🔴 CRITICAL QC issues. Senior sign-off required before distribution.</w:t>
+        </w:rPr>
+        <w:t xml:space="preserve">  Gate</w:t>
+      </w:r>
+      <w:proofErr w:type="gramEnd"/>
+      <w:r>
+        <w:rPr>
+          <w:rFonts w:ascii="Wix Madefor Display SemiBold" w:hAnsi="Wix Madefor Display SemiBold" w:cs="Wix Madefor Display SemiBold"/>
+          <w:b/>
+          <w:bCs/>
+          <w:color w:val="375623"/>
+        </w:rPr>
+        <w:t xml:space="preserve">: </w:t>
+      </w:r>
+      <w:r>
+        <w:rPr>
+          <w:color w:val="375623"/>
+        </w:rPr>
+        <w:t xml:space="preserve">Zero </w:t>
+      </w:r>
+      <w:r>
+        <w:rPr>
+          <w:color w:val="375623"/>
+        </w:rPr>
+        <w:t>🔴</w:t>
+      </w:r>
+      <w:r>
+        <w:rPr>
+          <w:color w:val="375623"/>
+        </w:rPr>
+        <w:t xml:space="preserve"> CRITICAL QC issues. Senior sign-off required before distribution.</w:t>
       </w:r>
     </w:p>
     <w:p>
@@ -2314,6 +2376,7 @@
           <w:sz w:val="22"/>
           <w:szCs w:val="22"/>
         </w:rPr>
+        <w:lastRenderedPageBreak/>
         <w:t>2. Individual Skill Quick-Reference</w:t>
       </w:r>
     </w:p>
@@ -2326,11 +2389,8 @@
           <w:rFonts w:ascii="Wix Madefor Display SemiBold" w:hAnsi="Wix Madefor Display SemiBold" w:cs="Wix Madefor Display SemiBold"/>
           <w:b/>
           <w:bCs/>
-          <w:color w:val="000000"/>
-          <w:sz w:val="18"/>
-          <w:szCs w:val="18"/>
-        </w:rPr>
-        <w:t xml:space="preserve">Any skill fires on its own trigger phrase — no need to invoke the full plugin.</w:t>
+        </w:rPr>
+        <w:t>Any skill fires on its own trigger phrase — no need to invoke the full plugin.</w:t>
       </w:r>
     </w:p>
     <w:tbl>
@@ -2350,6 +2410,7 @@
           <w:bottom w:w="80" w:type="dxa"/>
           <w:right w:w="120" w:type="dxa"/>
         </w:tblCellMar>
+        <w:tblLook w:val="04A0" w:firstRow="1" w:lastRow="0" w:firstColumn="1" w:lastColumn="0" w:noHBand="0" w:noVBand="1"/>
       </w:tblPr>
       <w:tblGrid>
         <w:gridCol w:w="2600"/>
@@ -2381,10 +2442,8 @@
                 <w:b/>
                 <w:bCs/>
                 <w:color w:val="FFFFFF"/>
-                <w:sz w:val="18"/>
-                <w:szCs w:val="18"/>
               </w:rPr>
-              <w:t xml:space="preserve">Skill</w:t>
+              <w:t>Skill</w:t>
             </w:r>
           </w:p>
         </w:tc>
@@ -2412,10 +2471,8 @@
                 <w:b/>
                 <w:bCs/>
                 <w:color w:val="FFFFFF"/>
-                <w:sz w:val="18"/>
-                <w:szCs w:val="18"/>
               </w:rPr>
-              <w:t xml:space="preserve">Trigger phrase</w:t>
+              <w:t>Trigger phrase</w:t>
             </w:r>
           </w:p>
         </w:tc>
@@ -2443,10 +2500,8 @@
                 <w:b/>
                 <w:bCs/>
                 <w:color w:val="FFFFFF"/>
-                <w:sz w:val="18"/>
-                <w:szCs w:val="18"/>
               </w:rPr>
-              <w:t xml:space="preserve">Use when</w:t>
+              <w:t>Use when</w:t>
             </w:r>
           </w:p>
         </w:tc>
@@ -2475,11 +2530,8 @@
                 <w:rFonts w:ascii="Wix Madefor Display SemiBold" w:hAnsi="Wix Madefor Display SemiBold" w:cs="Wix Madefor Display SemiBold"/>
                 <w:b/>
                 <w:bCs/>
-                <w:color w:val="000000"/>
-                <w:sz w:val="18"/>
-                <w:szCs w:val="18"/>
               </w:rPr>
-              <w:t xml:space="preserve">mckinsey-consultant</w:t>
+              <w:t>mckinsey-consultant</w:t>
             </w:r>
           </w:p>
         </w:tc>
@@ -2502,13 +2554,7 @@
           </w:tcPr>
           <w:p>
             <w:r>
-              <w:rPr>
-                <w:rFonts w:ascii="Wix Madefor Display" w:hAnsi="Wix Madefor Display" w:cs="Wix Madefor Display"/>
-                <w:color w:val="000000"/>
-                <w:sz w:val="18"/>
-                <w:szCs w:val="18"/>
-              </w:rPr>
-              <w:t xml:space="preserve">"Screen this deal", "Six Screening Questions"</w:t>
+              <w:t>"Screen this deal", "Six Screening Questions"</w:t>
             </w:r>
           </w:p>
         </w:tc>
@@ -2531,13 +2577,7 @@
           </w:tcPr>
           <w:p>
             <w:r>
-              <w:rPr>
-                <w:rFonts w:ascii="Wix Madefor Display" w:hAnsi="Wix Madefor Display" w:cs="Wix Madefor Display"/>
-                <w:color w:val="000000"/>
-                <w:sz w:val="18"/>
-                <w:szCs w:val="18"/>
-              </w:rPr>
-              <w:t xml:space="preserve">Phase 1 screen; issue tree; NTB scaffolding</w:t>
+              <w:t>Phase 1 screen; issue tree; NTB scaffolding</w:t>
             </w:r>
           </w:p>
         </w:tc>
@@ -2566,11 +2606,8 @@
                 <w:rFonts w:ascii="Wix Madefor Display SemiBold" w:hAnsi="Wix Madefor Display SemiBold" w:cs="Wix Madefor Display SemiBold"/>
                 <w:b/>
                 <w:bCs/>
-                <w:color w:val="000000"/>
-                <w:sz w:val="18"/>
-                <w:szCs w:val="18"/>
               </w:rPr>
-              <w:t xml:space="preserve">market-research</w:t>
+              <w:t>market-research</w:t>
             </w:r>
           </w:p>
         </w:tc>
@@ -2593,13 +2630,7 @@
           </w:tcPr>
           <w:p>
             <w:r>
-              <w:rPr>
-                <w:rFonts w:ascii="Wix Madefor Display" w:hAnsi="Wix Madefor Display" w:cs="Wix Madefor Display"/>
-                <w:color w:val="000000"/>
-                <w:sz w:val="18"/>
-                <w:szCs w:val="18"/>
-              </w:rPr>
-              <w:t xml:space="preserve">"Run market research on X", "deep dive on X"</w:t>
+              <w:t>"Run market research on X", "deep dive on X"</w:t>
             </w:r>
           </w:p>
         </w:tc>
@@ -2622,13 +2653,7 @@
           </w:tcPr>
           <w:p>
             <w:r>
-              <w:rPr>
-                <w:rFonts w:ascii="Wix Madefor Display" w:hAnsi="Wix Madefor Display" w:cs="Wix Madefor Display"/>
-                <w:color w:val="000000"/>
-                <w:sz w:val="18"/>
-                <w:szCs w:val="18"/>
-              </w:rPr>
-              <w:t xml:space="preserve">Full market pyramid; Phase 2 foundation</w:t>
+              <w:t>Full market pyramid; Phase 2 foundation</w:t>
             </w:r>
           </w:p>
         </w:tc>
@@ -2657,11 +2682,8 @@
                 <w:rFonts w:ascii="Wix Madefor Display SemiBold" w:hAnsi="Wix Madefor Display SemiBold" w:cs="Wix Madefor Display SemiBold"/>
                 <w:b/>
                 <w:bCs/>
-                <w:color w:val="000000"/>
-                <w:sz w:val="18"/>
-                <w:szCs w:val="18"/>
               </w:rPr>
-              <w:t xml:space="preserve">tam-sam-som-calculator</w:t>
+              <w:t>tam-sam-som-calculator</w:t>
             </w:r>
           </w:p>
         </w:tc>
@@ -2684,13 +2706,7 @@
           </w:tcPr>
           <w:p>
             <w:r>
-              <w:rPr>
-                <w:rFonts w:ascii="Wix Madefor Display" w:hAnsi="Wix Madefor Display" w:cs="Wix Madefor Display"/>
-                <w:color w:val="000000"/>
-                <w:sz w:val="18"/>
-                <w:szCs w:val="18"/>
-              </w:rPr>
-              <w:t xml:space="preserve">"What's the TAM for X", "size this market"</w:t>
+              <w:t>"What's the TAM for X", "size this market"</w:t>
             </w:r>
           </w:p>
         </w:tc>
@@ -2713,13 +2729,7 @@
           </w:tcPr>
           <w:p>
             <w:r>
-              <w:rPr>
-                <w:rFonts w:ascii="Wix Madefor Display" w:hAnsi="Wix Madefor Display" w:cs="Wix Madefor Display"/>
-                <w:color w:val="000000"/>
-                <w:sz w:val="18"/>
-                <w:szCs w:val="18"/>
-              </w:rPr>
-              <w:t xml:space="preserve">Gate 2 criterion 1; market sizing</w:t>
+              <w:t>Gate 2 criterion 1; market sizing</w:t>
             </w:r>
           </w:p>
         </w:tc>
@@ -2748,11 +2758,8 @@
                 <w:rFonts w:ascii="Wix Madefor Display SemiBold" w:hAnsi="Wix Madefor Display SemiBold" w:cs="Wix Madefor Display SemiBold"/>
                 <w:b/>
                 <w:bCs/>
-                <w:color w:val="000000"/>
-                <w:sz w:val="18"/>
-                <w:szCs w:val="18"/>
               </w:rPr>
-              <w:t xml:space="preserve">competitive-moat-assessment</w:t>
+              <w:t>competitive-moat-assessment</w:t>
             </w:r>
           </w:p>
         </w:tc>
@@ -2775,13 +2782,7 @@
           </w:tcPr>
           <w:p>
             <w:r>
-              <w:rPr>
-                <w:rFonts w:ascii="Wix Madefor Display" w:hAnsi="Wix Madefor Display" w:cs="Wix Madefor Display"/>
-                <w:color w:val="000000"/>
-                <w:sz w:val="18"/>
-                <w:szCs w:val="18"/>
-              </w:rPr>
-              <w:t xml:space="preserve">"Assess the moat", "how defensible is X"</w:t>
+              <w:t>"Assess the moat", "how defensible is X"</w:t>
             </w:r>
           </w:p>
         </w:tc>
@@ -2804,13 +2805,7 @@
           </w:tcPr>
           <w:p>
             <w:r>
-              <w:rPr>
-                <w:rFonts w:ascii="Wix Madefor Display" w:hAnsi="Wix Madefor Display" w:cs="Wix Madefor Display"/>
-                <w:color w:val="000000"/>
-                <w:sz w:val="18"/>
-                <w:szCs w:val="18"/>
-              </w:rPr>
-              <w:t xml:space="preserve">Moat depth per named competitor</w:t>
+              <w:t>Moat depth per named competitor</w:t>
             </w:r>
           </w:p>
         </w:tc>
@@ -2839,11 +2834,8 @@
                 <w:rFonts w:ascii="Wix Madefor Display SemiBold" w:hAnsi="Wix Madefor Display SemiBold" w:cs="Wix Madefor Display SemiBold"/>
                 <w:b/>
                 <w:bCs/>
-                <w:color w:val="000000"/>
-                <w:sz w:val="18"/>
-                <w:szCs w:val="18"/>
               </w:rPr>
-              <w:t xml:space="preserve">boundability</w:t>
+              <w:t>boundability</w:t>
             </w:r>
           </w:p>
         </w:tc>
@@ -2866,13 +2858,7 @@
           </w:tcPr>
           <w:p>
             <w:r>
-              <w:rPr>
-                <w:rFonts w:ascii="Wix Madefor Display" w:hAnsi="Wix Madefor Display" w:cs="Wix Madefor Display"/>
-                <w:color w:val="000000"/>
-                <w:sz w:val="18"/>
-                <w:szCs w:val="18"/>
-              </w:rPr>
-              <w:t xml:space="preserve">"Test the limits of this advantage"</w:t>
+              <w:t>"Test the limits of this advantage"</w:t>
             </w:r>
           </w:p>
         </w:tc>
@@ -2895,13 +2881,7 @@
           </w:tcPr>
           <w:p>
             <w:r>
-              <w:rPr>
-                <w:rFonts w:ascii="Wix Madefor Display" w:hAnsi="Wix Madefor Display" w:cs="Wix Madefor Display"/>
-                <w:color w:val="000000"/>
-                <w:sz w:val="18"/>
-                <w:szCs w:val="18"/>
-              </w:rPr>
-              <w:t xml:space="preserve">Where the moat holds vs. degrades</w:t>
+              <w:t>Where the moat holds vs. degrades</w:t>
             </w:r>
           </w:p>
         </w:tc>
@@ -2930,11 +2910,8 @@
                 <w:rFonts w:ascii="Wix Madefor Display SemiBold" w:hAnsi="Wix Madefor Display SemiBold" w:cs="Wix Madefor Display SemiBold"/>
                 <w:b/>
                 <w:bCs/>
-                <w:color w:val="000000"/>
-                <w:sz w:val="18"/>
-                <w:szCs w:val="18"/>
               </w:rPr>
-              <w:t xml:space="preserve">ntb-diligence</w:t>
+              <w:t>ntb-diligence</w:t>
             </w:r>
           </w:p>
         </w:tc>
@@ -2957,13 +2934,7 @@
           </w:tcPr>
           <w:p>
             <w:r>
-              <w:rPr>
-                <w:rFonts w:ascii="Wix Madefor Display" w:hAnsi="Wix Madefor Display" w:cs="Wix Madefor Display"/>
-                <w:color w:val="000000"/>
-                <w:sz w:val="18"/>
-                <w:szCs w:val="18"/>
-              </w:rPr>
-              <w:t xml:space="preserve">"NTB diligence on X", "cohort analysis"</w:t>
+              <w:t>"NTB diligence on X", "cohort analysis"</w:t>
             </w:r>
           </w:p>
         </w:tc>
@@ -2986,13 +2957,7 @@
           </w:tcPr>
           <w:p>
             <w:r>
-              <w:rPr>
-                <w:rFonts w:ascii="Wix Madefor Display" w:hAnsi="Wix Madefor Display" w:cs="Wix Madefor Display"/>
-                <w:color w:val="000000"/>
-                <w:sz w:val="18"/>
-                <w:szCs w:val="18"/>
-              </w:rPr>
-              <w:t xml:space="preserve">Phase 3 NTB quality check; MOIC sum</w:t>
+              <w:t>Phase 3 NTB quality check; MOIC sum</w:t>
             </w:r>
           </w:p>
         </w:tc>
@@ -3021,11 +2986,8 @@
                 <w:rFonts w:ascii="Wix Madefor Display SemiBold" w:hAnsi="Wix Madefor Display SemiBold" w:cs="Wix Madefor Display SemiBold"/>
                 <w:b/>
                 <w:bCs/>
-                <w:color w:val="000000"/>
-                <w:sz w:val="18"/>
-                <w:szCs w:val="18"/>
               </w:rPr>
-              <w:t xml:space="preserve">driver-tree</w:t>
+              <w:t>driver-tree</w:t>
             </w:r>
           </w:p>
         </w:tc>
@@ -3048,13 +3010,7 @@
           </w:tcPr>
           <w:p>
             <w:r>
-              <w:rPr>
-                <w:rFonts w:ascii="Wix Madefor Display" w:hAnsi="Wix Madefor Display" w:cs="Wix Madefor Display"/>
-                <w:color w:val="000000"/>
-                <w:sz w:val="18"/>
-                <w:szCs w:val="18"/>
-              </w:rPr>
-              <w:t xml:space="preserve">"Build a driver tree", "decompose this thesis"</w:t>
+              <w:t>"Build a driver tree", "decompose this thesis"</w:t>
             </w:r>
           </w:p>
         </w:tc>
@@ -3077,13 +3033,7 @@
           </w:tcPr>
           <w:p>
             <w:r>
-              <w:rPr>
-                <w:rFonts w:ascii="Wix Madefor Display" w:hAnsi="Wix Madefor Display" w:cs="Wix Madefor Display"/>
-                <w:color w:val="000000"/>
-                <w:sz w:val="18"/>
-                <w:szCs w:val="18"/>
-              </w:rPr>
-              <w:t xml:space="preserve">MECE causal tree; MOIC logic</w:t>
+              <w:t>MECE causal tree; MOIC logic</w:t>
             </w:r>
           </w:p>
         </w:tc>
@@ -3112,11 +3062,8 @@
                 <w:rFonts w:ascii="Wix Madefor Display SemiBold" w:hAnsi="Wix Madefor Display SemiBold" w:cs="Wix Madefor Display SemiBold"/>
                 <w:b/>
                 <w:bCs/>
-                <w:color w:val="000000"/>
-                <w:sz w:val="18"/>
-                <w:szCs w:val="18"/>
               </w:rPr>
-              <w:t xml:space="preserve">financial-model-builder</w:t>
+              <w:t>financial-model-builder</w:t>
             </w:r>
           </w:p>
         </w:tc>
@@ -3139,13 +3086,7 @@
           </w:tcPr>
           <w:p>
             <w:r>
-              <w:rPr>
-                <w:rFonts w:ascii="Wix Madefor Display" w:hAnsi="Wix Madefor Display" w:cs="Wix Madefor Display"/>
-                <w:color w:val="000000"/>
-                <w:sz w:val="18"/>
-                <w:szCs w:val="18"/>
-              </w:rPr>
-              <w:t xml:space="preserve">"Build financial model from this P&amp;L"</w:t>
+              <w:t>"Build financial model from this P&amp;L"</w:t>
             </w:r>
           </w:p>
         </w:tc>
@@ -3168,13 +3109,7 @@
           </w:tcPr>
           <w:p>
             <w:r>
-              <w:rPr>
-                <w:rFonts w:ascii="Wix Madefor Display" w:hAnsi="Wix Madefor Display" w:cs="Wix Madefor Display"/>
-                <w:color w:val="000000"/>
-                <w:sz w:val="18"/>
-                <w:szCs w:val="18"/>
-              </w:rPr>
-              <w:t xml:space="preserve">3-tab operating model from source data</w:t>
+              <w:t>3-tab operating model from source data</w:t>
             </w:r>
           </w:p>
         </w:tc>
@@ -3203,11 +3138,8 @@
                 <w:rFonts w:ascii="Wix Madefor Display SemiBold" w:hAnsi="Wix Madefor Display SemiBold" w:cs="Wix Madefor Display SemiBold"/>
                 <w:b/>
                 <w:bCs/>
-                <w:color w:val="000000"/>
-                <w:sz w:val="18"/>
-                <w:szCs w:val="18"/>
               </w:rPr>
-              <w:t xml:space="preserve">gtm-metrics-analyzer</w:t>
+              <w:t>gtm-metrics-analyzer</w:t>
             </w:r>
           </w:p>
         </w:tc>
@@ -3230,13 +3162,7 @@
           </w:tcPr>
           <w:p>
             <w:r>
-              <w:rPr>
-                <w:rFonts w:ascii="Wix Madefor Display" w:hAnsi="Wix Madefor Display" w:cs="Wix Madefor Display"/>
-                <w:color w:val="000000"/>
-                <w:sz w:val="18"/>
-                <w:szCs w:val="18"/>
-              </w:rPr>
-              <w:t xml:space="preserve">"Analyze these GTM metrics", "GTM workbook"</w:t>
+              <w:t>"Analyze these GTM metrics", "GTM workbook"</w:t>
             </w:r>
           </w:p>
         </w:tc>
@@ -3259,13 +3185,7 @@
           </w:tcPr>
           <w:p>
             <w:r>
-              <w:rPr>
-                <w:rFonts w:ascii="Wix Madefor Display" w:hAnsi="Wix Madefor Display" w:cs="Wix Madefor Display"/>
-                <w:color w:val="000000"/>
-                <w:sz w:val="18"/>
-                <w:szCs w:val="18"/>
-              </w:rPr>
-              <w:t xml:space="preserve">48 GTM metrics; ARR diagnostic</w:t>
+              <w:t>48 GTM metrics; ARR diagnostic</w:t>
             </w:r>
           </w:p>
         </w:tc>
@@ -3294,11 +3214,8 @@
                 <w:rFonts w:ascii="Wix Madefor Display SemiBold" w:hAnsi="Wix Madefor Display SemiBold" w:cs="Wix Madefor Display SemiBold"/>
                 <w:b/>
                 <w:bCs/>
-                <w:color w:val="000000"/>
-                <w:sz w:val="18"/>
-                <w:szCs w:val="18"/>
               </w:rPr>
-              <w:t xml:space="preserve">kpi-tree-builder</w:t>
+              <w:t>kpi-tree-builder</w:t>
             </w:r>
           </w:p>
         </w:tc>
@@ -3321,13 +3238,7 @@
           </w:tcPr>
           <w:p>
             <w:r>
-              <w:rPr>
-                <w:rFonts w:ascii="Wix Madefor Display" w:hAnsi="Wix Madefor Display" w:cs="Wix Madefor Display"/>
-                <w:color w:val="000000"/>
-                <w:sz w:val="18"/>
-                <w:szCs w:val="18"/>
-              </w:rPr>
-              <w:t xml:space="preserve">"Audit this plan", "post-close KPIs"</w:t>
+              <w:t>"Audit this plan", "post-close KPIs"</w:t>
             </w:r>
           </w:p>
         </w:tc>
@@ -3350,13 +3261,7 @@
           </w:tcPr>
           <w:p>
             <w:r>
-              <w:rPr>
-                <w:rFonts w:ascii="Wix Madefor Display" w:hAnsi="Wix Madefor Display" w:cs="Wix Madefor Display"/>
-                <w:color w:val="000000"/>
-                <w:sz w:val="18"/>
-                <w:szCs w:val="18"/>
-              </w:rPr>
-              <w:t xml:space="preserve">Budget credibility; management plan audit</w:t>
+              <w:t>Budget credibility; management plan audit</w:t>
             </w:r>
           </w:p>
         </w:tc>
@@ -3385,11 +3290,8 @@
                 <w:rFonts w:ascii="Wix Madefor Display SemiBold" w:hAnsi="Wix Madefor Display SemiBold" w:cs="Wix Madefor Display SemiBold"/>
                 <w:b/>
                 <w:bCs/>
-                <w:color w:val="000000"/>
-                <w:sz w:val="18"/>
-                <w:szCs w:val="18"/>
               </w:rPr>
-              <w:t xml:space="preserve">ic-memo</w:t>
+              <w:t>ic-memo</w:t>
             </w:r>
           </w:p>
         </w:tc>
@@ -3412,13 +3314,7 @@
           </w:tcPr>
           <w:p>
             <w:r>
-              <w:rPr>
-                <w:rFonts w:ascii="Wix Madefor Display" w:hAnsi="Wix Madefor Display" w:cs="Wix Madefor Display"/>
-                <w:color w:val="000000"/>
-                <w:sz w:val="18"/>
-                <w:szCs w:val="18"/>
-              </w:rPr>
-              <w:t xml:space="preserve">"Write the IC memo", "IC memo for X"</w:t>
+              <w:t>"Write the IC memo", "IC memo for X"</w:t>
             </w:r>
           </w:p>
         </w:tc>
@@ -3441,13 +3337,7 @@
           </w:tcPr>
           <w:p>
             <w:r>
-              <w:rPr>
-                <w:rFonts w:ascii="Wix Madefor Display" w:hAnsi="Wix Madefor Display" w:cs="Wix Madefor Display"/>
-                <w:color w:val="000000"/>
-                <w:sz w:val="18"/>
-                <w:szCs w:val="18"/>
-              </w:rPr>
-              <w:t xml:space="preserve">Full 10-section memo; NTB registry</w:t>
+              <w:t>Full 10-section memo; NTB registry</w:t>
             </w:r>
           </w:p>
         </w:tc>
@@ -3476,11 +3366,8 @@
                 <w:rFonts w:ascii="Wix Madefor Display SemiBold" w:hAnsi="Wix Madefor Display SemiBold" w:cs="Wix Madefor Display SemiBold"/>
                 <w:b/>
                 <w:bCs/>
-                <w:color w:val="000000"/>
-                <w:sz w:val="18"/>
-                <w:szCs w:val="18"/>
               </w:rPr>
-              <w:t xml:space="preserve">diligence-ddr</w:t>
+              <w:t>diligence-ddr</w:t>
             </w:r>
           </w:p>
         </w:tc>
@@ -3503,13 +3390,7 @@
           </w:tcPr>
           <w:p>
             <w:r>
-              <w:rPr>
-                <w:rFonts w:ascii="Wix Madefor Display" w:hAnsi="Wix Madefor Display" w:cs="Wix Madefor Display"/>
-                <w:color w:val="000000"/>
-                <w:sz w:val="18"/>
-                <w:szCs w:val="18"/>
-              </w:rPr>
-              <w:t xml:space="preserve">"DDR", "data room request list"</w:t>
+              <w:t>"DDR", "data room request list"</w:t>
             </w:r>
           </w:p>
         </w:tc>
@@ -3532,13 +3413,7 @@
           </w:tcPr>
           <w:p>
             <w:r>
-              <w:rPr>
-                <w:rFonts w:ascii="Wix Madefor Display" w:hAnsi="Wix Madefor Display" w:cs="Wix Madefor Display"/>
-                <w:color w:val="000000"/>
-                <w:sz w:val="18"/>
-                <w:szCs w:val="18"/>
-              </w:rPr>
-              <w:t xml:space="preserve">Tailored diligence checklist</w:t>
+              <w:t>Tailored diligence checklist</w:t>
             </w:r>
           </w:p>
         </w:tc>
@@ -3567,11 +3442,8 @@
                 <w:rFonts w:ascii="Wix Madefor Display SemiBold" w:hAnsi="Wix Madefor Display SemiBold" w:cs="Wix Madefor Display SemiBold"/>
                 <w:b/>
                 <w:bCs/>
-                <w:color w:val="000000"/>
-                <w:sz w:val="18"/>
-                <w:szCs w:val="18"/>
               </w:rPr>
-              <w:t xml:space="preserve">claim-scrutinizer</w:t>
+              <w:t>claim-scrutinizer</w:t>
             </w:r>
           </w:p>
         </w:tc>
@@ -3594,13 +3466,7 @@
           </w:tcPr>
           <w:p>
             <w:r>
-              <w:rPr>
-                <w:rFonts w:ascii="Wix Madefor Display" w:hAnsi="Wix Madefor Display" w:cs="Wix Madefor Display"/>
-                <w:color w:val="000000"/>
-                <w:sz w:val="18"/>
-                <w:szCs w:val="18"/>
-              </w:rPr>
-              <w:t xml:space="preserve">"Claim-scrutinize this", "is this IC-ready"</w:t>
+              <w:t>"Claim-scrutinize this", "is this IC-ready"</w:t>
             </w:r>
           </w:p>
         </w:tc>
@@ -3623,13 +3489,7 @@
           </w:tcPr>
           <w:p>
             <w:r>
-              <w:rPr>
-                <w:rFonts w:ascii="Wix Madefor Display" w:hAnsi="Wix Madefor Display" w:cs="Wix Madefor Display"/>
-                <w:color w:val="000000"/>
-                <w:sz w:val="18"/>
-                <w:szCs w:val="18"/>
-              </w:rPr>
-              <w:t xml:space="preserve">Structure + claim quality check</w:t>
+              <w:t>Structure + claim quality check</w:t>
             </w:r>
           </w:p>
         </w:tc>
@@ -3653,17 +3513,16 @@
             </w:tcMar>
           </w:tcPr>
           <w:p>
+            <w:proofErr w:type="gramStart"/>
             <w:r>
               <w:rPr>
                 <w:rFonts w:ascii="Wix Madefor Display SemiBold" w:hAnsi="Wix Madefor Display SemiBold" w:cs="Wix Madefor Display SemiBold"/>
                 <w:b/>
                 <w:bCs/>
-                <w:color w:val="000000"/>
-                <w:sz w:val="18"/>
-                <w:szCs w:val="18"/>
               </w:rPr>
-              <w:t xml:space="preserve">red-team</w:t>
-            </w:r>
+              <w:t>red-team</w:t>
+            </w:r>
+            <w:proofErr w:type="gramEnd"/>
           </w:p>
         </w:tc>
         <w:tc>
@@ -3685,13 +3544,7 @@
           </w:tcPr>
           <w:p>
             <w:r>
-              <w:rPr>
-                <w:rFonts w:ascii="Wix Madefor Display" w:hAnsi="Wix Madefor Display" w:cs="Wix Madefor Display"/>
-                <w:color w:val="000000"/>
-                <w:sz w:val="18"/>
-                <w:szCs w:val="18"/>
-              </w:rPr>
-              <w:t xml:space="preserve">"Red team this", "make the bear case"</w:t>
+              <w:t>"Red team this", "make the bear case"</w:t>
             </w:r>
           </w:p>
         </w:tc>
@@ -3714,13 +3567,7 @@
           </w:tcPr>
           <w:p>
             <w:r>
-              <w:rPr>
-                <w:rFonts w:ascii="Wix Madefor Display" w:hAnsi="Wix Madefor Display" w:cs="Wix Madefor Display"/>
-                <w:color w:val="000000"/>
-                <w:sz w:val="18"/>
-                <w:szCs w:val="18"/>
-              </w:rPr>
-              <w:t xml:space="preserve">Investment attack; KILL-rated risk flags</w:t>
+              <w:t>Investment attack; KILL-rated risk flags</w:t>
             </w:r>
           </w:p>
         </w:tc>
@@ -3749,11 +3596,8 @@
                 <w:rFonts w:ascii="Wix Madefor Display SemiBold" w:hAnsi="Wix Madefor Display SemiBold" w:cs="Wix Madefor Display SemiBold"/>
                 <w:b/>
                 <w:bCs/>
-                <w:color w:val="000000"/>
-                <w:sz w:val="18"/>
-                <w:szCs w:val="18"/>
               </w:rPr>
-              <w:t xml:space="preserve">pre-mortem</w:t>
+              <w:t>pre-mortem</w:t>
             </w:r>
           </w:p>
         </w:tc>
@@ -3776,13 +3620,7 @@
           </w:tcPr>
           <w:p>
             <w:r>
-              <w:rPr>
-                <w:rFonts w:ascii="Wix Madefor Display" w:hAnsi="Wix Madefor Display" w:cs="Wix Madefor Display"/>
-                <w:color w:val="000000"/>
-                <w:sz w:val="18"/>
-                <w:szCs w:val="18"/>
-              </w:rPr>
-              <w:t xml:space="preserve">"Pre-mortem this deal", "how does this fail"</w:t>
+              <w:t>"Pre-mortem this deal", "how does this fail"</w:t>
             </w:r>
           </w:p>
         </w:tc>
@@ -3805,13 +3643,7 @@
           </w:tcPr>
           <w:p>
             <w:r>
-              <w:rPr>
-                <w:rFonts w:ascii="Wix Madefor Display" w:hAnsi="Wix Madefor Display" w:cs="Wix Madefor Display"/>
-                <w:color w:val="000000"/>
-                <w:sz w:val="18"/>
-                <w:szCs w:val="18"/>
-              </w:rPr>
-              <w:t xml:space="preserve">Failure mapping; compound risk paths</w:t>
+              <w:t>Failure mapping; compound risk paths</w:t>
             </w:r>
           </w:p>
         </w:tc>
@@ -3840,11 +3672,8 @@
                 <w:rFonts w:ascii="Wix Madefor Display SemiBold" w:hAnsi="Wix Madefor Display SemiBold" w:cs="Wix Madefor Display SemiBold"/>
                 <w:b/>
                 <w:bCs/>
-                <w:color w:val="000000"/>
-                <w:sz w:val="18"/>
-                <w:szCs w:val="18"/>
               </w:rPr>
-              <w:t xml:space="preserve">writing-style</w:t>
+              <w:t>writing-style</w:t>
             </w:r>
           </w:p>
         </w:tc>
@@ -3867,13 +3696,7 @@
           </w:tcPr>
           <w:p>
             <w:r>
-              <w:rPr>
-                <w:rFonts w:ascii="Wix Madefor Display" w:hAnsi="Wix Madefor Display" w:cs="Wix Madefor Display"/>
-                <w:color w:val="000000"/>
-                <w:sz w:val="18"/>
-                <w:szCs w:val="18"/>
-              </w:rPr>
-              <w:t xml:space="preserve">(auto-runs before all production)</w:t>
+              <w:t>(auto-runs before all production)</w:t>
             </w:r>
           </w:p>
         </w:tc>
@@ -3896,13 +3719,7 @@
           </w:tcPr>
           <w:p>
             <w:r>
-              <w:rPr>
-                <w:rFonts w:ascii="Wix Madefor Display" w:hAnsi="Wix Madefor Display" w:cs="Wix Madefor Display"/>
-                <w:color w:val="000000"/>
-                <w:sz w:val="18"/>
-                <w:szCs w:val="18"/>
-              </w:rPr>
-              <w:t xml:space="preserve">Prose quality; epistemic tagging [F]/[E]/[H]</w:t>
+              <w:t>Prose quality; epistemic tagging [F]/[E]/[H]</w:t>
             </w:r>
           </w:p>
         </w:tc>
@@ -3931,11 +3748,8 @@
                 <w:rFonts w:ascii="Wix Madefor Display SemiBold" w:hAnsi="Wix Madefor Display SemiBold" w:cs="Wix Madefor Display SemiBold"/>
                 <w:b/>
                 <w:bCs/>
-                <w:color w:val="000000"/>
-                <w:sz w:val="18"/>
-                <w:szCs w:val="18"/>
               </w:rPr>
-              <w:t xml:space="preserve">finance-metrics-quickref</w:t>
+              <w:t>finance-metrics-quickref</w:t>
             </w:r>
           </w:p>
         </w:tc>
@@ -3958,13 +3772,7 @@
           </w:tcPr>
           <w:p>
             <w:r>
-              <w:rPr>
-                <w:rFonts w:ascii="Wix Madefor Display" w:hAnsi="Wix Madefor Display" w:cs="Wix Madefor Display"/>
-                <w:color w:val="000000"/>
-                <w:sz w:val="18"/>
-                <w:szCs w:val="18"/>
-              </w:rPr>
-              <w:t xml:space="preserve">"What's the formula for X", "benchmark for X"</w:t>
+              <w:t>"What's the formula for X", "benchmark for X"</w:t>
             </w:r>
           </w:p>
         </w:tc>
@@ -3987,13 +3795,7 @@
           </w:tcPr>
           <w:p>
             <w:r>
-              <w:rPr>
-                <w:rFonts w:ascii="Wix Madefor Display" w:hAnsi="Wix Madefor Display" w:cs="Wix Madefor Display"/>
-                <w:color w:val="000000"/>
-                <w:sz w:val="18"/>
-                <w:szCs w:val="18"/>
-              </w:rPr>
-              <w:t xml:space="preserve">Inline metric lookup at any phase</w:t>
+              <w:t>Inline metric lookup at any phase</w:t>
             </w:r>
           </w:p>
         </w:tc>
@@ -4022,11 +3824,8 @@
                 <w:rFonts w:ascii="Wix Madefor Display SemiBold" w:hAnsi="Wix Madefor Display SemiBold" w:cs="Wix Madefor Display SemiBold"/>
                 <w:b/>
                 <w:bCs/>
-                <w:color w:val="000000"/>
-                <w:sz w:val="18"/>
-                <w:szCs w:val="18"/>
               </w:rPr>
-              <w:t xml:space="preserve">executive-summary-writer</w:t>
+              <w:t>executive-summary-writer</w:t>
             </w:r>
           </w:p>
         </w:tc>
@@ -4049,13 +3848,7 @@
           </w:tcPr>
           <w:p>
             <w:r>
-              <w:rPr>
-                <w:rFonts w:ascii="Wix Madefor Display" w:hAnsi="Wix Madefor Display" w:cs="Wix Madefor Display"/>
-                <w:color w:val="000000"/>
-                <w:sz w:val="18"/>
-                <w:szCs w:val="18"/>
-              </w:rPr>
-              <w:t xml:space="preserve">"Write the executive summary"</w:t>
+              <w:t>"Write the executive summary"</w:t>
             </w:r>
           </w:p>
         </w:tc>
@@ -4078,13 +3871,7 @@
           </w:tcPr>
           <w:p>
             <w:r>
-              <w:rPr>
-                <w:rFonts w:ascii="Wix Madefor Display" w:hAnsi="Wix Madefor Display" w:cs="Wix Madefor Display"/>
-                <w:color w:val="000000"/>
-                <w:sz w:val="18"/>
-                <w:szCs w:val="18"/>
-              </w:rPr>
-              <w:t xml:space="preserve">One-page distillation from completed memo</w:t>
+              <w:t>One-page distillation from completed memo</w:t>
             </w:r>
           </w:p>
         </w:tc>
@@ -4113,11 +3900,8 @@
                 <w:rFonts w:ascii="Wix Madefor Display SemiBold" w:hAnsi="Wix Madefor Display SemiBold" w:cs="Wix Madefor Display SemiBold"/>
                 <w:b/>
                 <w:bCs/>
-                <w:color w:val="000000"/>
-                <w:sz w:val="18"/>
-                <w:szCs w:val="18"/>
               </w:rPr>
-              <w:t xml:space="preserve">pattern-docx</w:t>
+              <w:t>pattern-docx</w:t>
             </w:r>
           </w:p>
         </w:tc>
@@ -4140,13 +3924,7 @@
           </w:tcPr>
           <w:p>
             <w:r>
-              <w:rPr>
-                <w:rFonts w:ascii="Wix Madefor Display" w:hAnsi="Wix Madefor Display" w:cs="Wix Madefor Display"/>
-                <w:color w:val="000000"/>
-                <w:sz w:val="18"/>
-                <w:szCs w:val="18"/>
-              </w:rPr>
-              <w:t xml:space="preserve">"Create a Pattern memo"</w:t>
+              <w:t>"Create a Pattern memo"</w:t>
             </w:r>
           </w:p>
         </w:tc>
@@ -4169,13 +3947,7 @@
           </w:tcPr>
           <w:p>
             <w:r>
-              <w:rPr>
-                <w:rFonts w:ascii="Wix Madefor Display" w:hAnsi="Wix Madefor Display" w:cs="Wix Madefor Display"/>
-                <w:color w:val="000000"/>
-                <w:sz w:val="18"/>
-                <w:szCs w:val="18"/>
-              </w:rPr>
-              <w:t xml:space="preserve">Branded Word output; Pattern template</w:t>
+              <w:t>Branded Word output; Pattern template</w:t>
             </w:r>
           </w:p>
         </w:tc>
@@ -4204,11 +3976,8 @@
                 <w:rFonts w:ascii="Wix Madefor Display SemiBold" w:hAnsi="Wix Madefor Display SemiBold" w:cs="Wix Madefor Display SemiBold"/>
                 <w:b/>
                 <w:bCs/>
-                <w:color w:val="000000"/>
-                <w:sz w:val="18"/>
-                <w:szCs w:val="18"/>
               </w:rPr>
-              <w:t xml:space="preserve">pattern-investment-pptx</w:t>
+              <w:t>pattern-investment-pptx</w:t>
             </w:r>
           </w:p>
         </w:tc>
@@ -4231,13 +4000,7 @@
           </w:tcPr>
           <w:p>
             <w:r>
-              <w:rPr>
-                <w:rFonts w:ascii="Wix Madefor Display" w:hAnsi="Wix Madefor Display" w:cs="Wix Madefor Display"/>
-                <w:color w:val="000000"/>
-                <w:sz w:val="18"/>
-                <w:szCs w:val="18"/>
-              </w:rPr>
-              <w:t xml:space="preserve">"Create an investment deck"</w:t>
+              <w:t>"Create an investment deck"</w:t>
             </w:r>
           </w:p>
         </w:tc>
@@ -4260,13 +4023,7 @@
           </w:tcPr>
           <w:p>
             <w:r>
-              <w:rPr>
-                <w:rFonts w:ascii="Wix Madefor Display" w:hAnsi="Wix Madefor Display" w:cs="Wix Madefor Display"/>
-                <w:color w:val="000000"/>
-                <w:sz w:val="18"/>
-                <w:szCs w:val="18"/>
-              </w:rPr>
-              <w:t xml:space="preserve">Branded PowerPoint; IC deck format</w:t>
+              <w:t>Branded PowerPoint; IC deck format</w:t>
             </w:r>
           </w:p>
         </w:tc>
@@ -4295,11 +4052,8 @@
                 <w:rFonts w:ascii="Wix Madefor Display SemiBold" w:hAnsi="Wix Madefor Display SemiBold" w:cs="Wix Madefor Display SemiBold"/>
                 <w:b/>
                 <w:bCs/>
-                <w:color w:val="000000"/>
-                <w:sz w:val="18"/>
-                <w:szCs w:val="18"/>
               </w:rPr>
-              <w:t xml:space="preserve">doc-quality-checker</w:t>
+              <w:t>doc-quality-checker</w:t>
             </w:r>
           </w:p>
         </w:tc>
@@ -4322,13 +4076,7 @@
           </w:tcPr>
           <w:p>
             <w:r>
-              <w:rPr>
-                <w:rFonts w:ascii="Wix Madefor Display" w:hAnsi="Wix Madefor Display" w:cs="Wix Madefor Display"/>
-                <w:color w:val="000000"/>
-                <w:sz w:val="18"/>
-                <w:szCs w:val="18"/>
-              </w:rPr>
-              <w:t xml:space="preserve">(auto-runs after every Pattern doc)</w:t>
+              <w:t>(auto-runs after every Pattern doc)</w:t>
             </w:r>
           </w:p>
         </w:tc>
@@ -4351,13 +4099,7 @@
           </w:tcPr>
           <w:p>
             <w:r>
-              <w:rPr>
-                <w:rFonts w:ascii="Wix Madefor Display" w:hAnsi="Wix Madefor Display" w:cs="Wix Madefor Display"/>
-                <w:color w:val="000000"/>
-                <w:sz w:val="18"/>
-                <w:szCs w:val="18"/>
-              </w:rPr>
-              <w:t xml:space="preserve">Format + content QC; CRITICAL flag resolution</w:t>
+              <w:t>Format + content QC; CRITICAL flag resolution</w:t>
             </w:r>
           </w:p>
         </w:tc>
@@ -4386,11 +4128,8 @@
                 <w:rFonts w:ascii="Wix Madefor Display SemiBold" w:hAnsi="Wix Madefor Display SemiBold" w:cs="Wix Madefor Display SemiBold"/>
                 <w:b/>
                 <w:bCs/>
-                <w:color w:val="000000"/>
-                <w:sz w:val="18"/>
-                <w:szCs w:val="18"/>
               </w:rPr>
-              <w:t xml:space="preserve">competitive-landscape-deliverable</w:t>
+              <w:t>competitive-landscape-deliverable</w:t>
             </w:r>
           </w:p>
         </w:tc>
@@ -4413,13 +4152,7 @@
           </w:tcPr>
           <w:p>
             <w:r>
-              <w:rPr>
-                <w:rFonts w:ascii="Wix Madefor Display" w:hAnsi="Wix Madefor Display" w:cs="Wix Madefor Display"/>
-                <w:color w:val="000000"/>
-                <w:sz w:val="18"/>
-                <w:szCs w:val="18"/>
-              </w:rPr>
-              <w:t xml:space="preserve">"Build deliverable from competitor sheet"</w:t>
+              <w:t>"Build deliverable from competitor sheet"</w:t>
             </w:r>
           </w:p>
         </w:tc>
@@ -4442,13 +4175,7 @@
           </w:tcPr>
           <w:p>
             <w:r>
-              <w:rPr>
-                <w:rFonts w:ascii="Wix Madefor Display" w:hAnsi="Wix Madefor Display" w:cs="Wix Madefor Display"/>
-                <w:color w:val="000000"/>
-                <w:sz w:val="18"/>
-                <w:szCs w:val="18"/>
-              </w:rPr>
-              <w:t xml:space="preserve">Phase 0 landscape framing</w:t>
+              <w:t>Phase 0 landscape framing</w:t>
             </w:r>
           </w:p>
         </w:tc>
@@ -4470,6 +4197,7 @@
           <w:sz w:val="22"/>
           <w:szCs w:val="22"/>
         </w:rPr>
+        <w:lastRenderedPageBreak/>
         <w:t>3. Key Rules</w:t>
       </w:r>
     </w:p>
@@ -4482,11 +4210,8 @@
           <w:rFonts w:ascii="Wix Madefor Display SemiBold" w:hAnsi="Wix Madefor Display SemiBold" w:cs="Wix Madefor Display SemiBold"/>
           <w:b/>
           <w:bCs/>
-          <w:color w:val="000000"/>
-          <w:sz w:val="18"/>
-          <w:szCs w:val="18"/>
-        </w:rPr>
-        <w:t xml:space="preserve">What determines Sea Ltd IC memo quality vs. a thin first draft.</w:t>
+        </w:rPr>
+        <w:t>What determines Sea Ltd IC memo quality vs. a thin first draft.</w:t>
       </w:r>
     </w:p>
     <w:p>
@@ -4506,13 +4231,7 @@
         <w:spacing w:after="120"/>
       </w:pPr>
       <w:r>
-        <w:rPr>
-          <w:rFonts w:ascii="Wix Madefor Display" w:hAnsi="Wix Madefor Display" w:cs="Wix Madefor Display"/>
-          <w:color w:val="000000"/>
-          <w:sz w:val="18"/>
-          <w:szCs w:val="18"/>
-        </w:rPr>
-        <w:t xml:space="preserve">The NTB registry is derived from the thesis. A vague thesis produces a vague registry and thin diligence throughout. One clear sentence before Phase 1 pays dividends across every subsequent phase.</w:t>
+        <w:t>The NTB registry is derived from the thesis. A vague thesis produces a vague registry and thin diligence throughout. One clear sentence before Phase 1 pays dividends across every subsequent phase.</w:t>
       </w:r>
     </w:p>
     <w:p>
@@ -4532,13 +4251,7 @@
         <w:spacing w:after="120"/>
       </w:pPr>
       <w:r>
-        <w:rPr>
-          <w:rFonts w:ascii="Wix Madefor Display" w:hAnsi="Wix Madefor Display" w:cs="Wix Madefor Display"/>
-          <w:color w:val="000000"/>
-          <w:sz w:val="18"/>
-          <w:szCs w:val="18"/>
-        </w:rPr>
-        <w:t xml:space="preserve">Most AI-generated memos jump from market research directly to drafting. Phase 3 — ntb-diligence, driver-tree, financial-model-builder, gtm-metrics-analyzer, kpi-tree-builder — is what makes the MOIC logic auditable and prevents claim-scrutinizer failures at Phase 5.</w:t>
+        <w:t>Most AI-generated memos jump from market research directly to drafting. Phase 3 — ntb-diligence, driver-tree, financial-model-builder, gtm-metrics-analyzer, kpi-tree-builder — is what makes the MOIC logic auditable and prevents claim-scrutinizer failures at Phase 5.</w:t>
       </w:r>
     </w:p>
     <w:p>
@@ -4558,13 +4271,7 @@
         <w:spacing w:after="120"/>
       </w:pPr>
       <w:r>
-        <w:rPr>
-          <w:rFonts w:ascii="Wix Madefor Display" w:hAnsi="Wix Madefor Display" w:cs="Wix Madefor Display"/>
-          <w:color w:val="000000"/>
-          <w:sz w:val="18"/>
-          <w:szCs w:val="18"/>
-        </w:rPr>
-        <w:t xml:space="preserve">claim-scrutinizer, red-team, and pre-mortem catch different failure classes. Running them as a single pass misses structural gaps (claim-scrutinizer), adversarial attack angles (red-team), and compound failure paths (pre-mortem). Each must run in full.</w:t>
+        <w:t>claim-scrutinizer, red-team, and pre-mortem catch different failure classes. Running them as a single pass misses structural gaps (claim-scrutinizer), adversarial attack angles (red-team), and compound failure paths (pre-mortem). Each must run in full.</w:t>
       </w:r>
     </w:p>
     <w:p>
@@ -4584,13 +4291,7 @@
         <w:spacing w:after="120"/>
       </w:pPr>
       <w:r>
-        <w:rPr>
-          <w:rFonts w:ascii="Wix Madefor Display" w:hAnsi="Wix Madefor Display" w:cs="Wix Madefor Display"/>
-          <w:color w:val="000000"/>
-          <w:sz w:val="18"/>
-          <w:szCs w:val="18"/>
-        </w:rPr>
-        <w:t xml:space="preserve">The agent pauses at each gate for your review before proceeding. Every NTB must have ≥6 evidence bullets before memo drafting begins. Compressing phases produces thin evidence that fails at Phase 5.</w:t>
+        <w:t>The agent pauses at each gate for your review before proceeding. Every NTB must have ≥6 evidence bullets before memo drafting begins. Compressing phases produces thin evidence that fails at Phase 5.</w:t>
       </w:r>
     </w:p>
     <w:p>
@@ -4610,13 +4311,7 @@
         <w:spacing w:after="120"/>
       </w:pPr>
       <w:r>
-        <w:rPr>
-          <w:rFonts w:ascii="Wix Madefor Display" w:hAnsi="Wix Madefor Display" w:cs="Wix Madefor Display"/>
-          <w:color w:val="000000"/>
-          <w:sz w:val="18"/>
-          <w:szCs w:val="18"/>
-        </w:rPr>
-        <w:t xml:space="preserve">Ask "what's a good benchmark for [metric]" at any phase. It answers inline without interrupting the workflow.</w:t>
+        <w:t>Ask "what's a good benchmark for [metric]" at any phase. It answers inline without interrupting the workflow.</w:t>
       </w:r>
     </w:p>
     <w:p>
@@ -4641,6 +4336,7 @@
           <w:bottom w:w="80" w:type="dxa"/>
           <w:right w:w="120" w:type="dxa"/>
         </w:tblCellMar>
+        <w:tblLook w:val="04A0" w:firstRow="1" w:lastRow="0" w:firstColumn="1" w:lastColumn="0" w:noHBand="0" w:noVBand="1"/>
       </w:tblPr>
       <w:tblGrid>
         <w:gridCol w:w="2000"/>
@@ -4671,10 +4367,8 @@
                 <w:b/>
                 <w:bCs/>
                 <w:color w:val="FFFFFF"/>
-                <w:sz w:val="18"/>
-                <w:szCs w:val="18"/>
               </w:rPr>
-              <w:t xml:space="preserve">Guardrail</w:t>
+              <w:t>Guardrail</w:t>
             </w:r>
           </w:p>
         </w:tc>
@@ -4702,10 +4396,8 @@
                 <w:b/>
                 <w:bCs/>
                 <w:color w:val="FFFFFF"/>
-                <w:sz w:val="18"/>
-                <w:szCs w:val="18"/>
               </w:rPr>
-              <w:t xml:space="preserve">Rule</w:t>
+              <w:t>Rule</w:t>
             </w:r>
           </w:p>
         </w:tc>
@@ -4734,11 +4426,8 @@
                 <w:rFonts w:ascii="Wix Madefor Display SemiBold" w:hAnsi="Wix Madefor Display SemiBold" w:cs="Wix Madefor Display SemiBold"/>
                 <w:b/>
                 <w:bCs/>
-                <w:color w:val="000000"/>
-                <w:sz w:val="18"/>
-                <w:szCs w:val="18"/>
               </w:rPr>
-              <w:t xml:space="preserve">NTB evidence</w:t>
+              <w:t>NTB evidence</w:t>
             </w:r>
           </w:p>
         </w:tc>
@@ -4761,13 +4450,7 @@
           </w:tcPr>
           <w:p>
             <w:r>
-              <w:rPr>
-                <w:rFonts w:ascii="Wix Madefor Display" w:hAnsi="Wix Madefor Display" w:cs="Wix Madefor Display"/>
-                <w:color w:val="000000"/>
-                <w:sz w:val="18"/>
-                <w:szCs w:val="18"/>
-              </w:rPr>
-              <w:t xml:space="preserve">≥6 evidence bullets per NTB required before Phase 4 drafting begins</w:t>
+              <w:t>≥6 evidence bullets per NTB required before Phase 4 drafting begins</w:t>
             </w:r>
           </w:p>
         </w:tc>
@@ -4796,11 +4479,8 @@
                 <w:rFonts w:ascii="Wix Madefor Display SemiBold" w:hAnsi="Wix Madefor Display SemiBold" w:cs="Wix Madefor Display SemiBold"/>
                 <w:b/>
                 <w:bCs/>
-                <w:color w:val="000000"/>
-                <w:sz w:val="18"/>
-                <w:szCs w:val="18"/>
               </w:rPr>
-              <w:t xml:space="preserve">Claim tagging</w:t>
+              <w:t>Claim tagging</w:t>
             </w:r>
           </w:p>
         </w:tc>
@@ -4823,13 +4503,7 @@
           </w:tcPr>
           <w:p>
             <w:r>
-              <w:rPr>
-                <w:rFonts w:ascii="Wix Madefor Display" w:hAnsi="Wix Madefor Display" w:cs="Wix Madefor Display"/>
-                <w:color w:val="000000"/>
-                <w:sz w:val="18"/>
-                <w:szCs w:val="18"/>
-              </w:rPr>
-              <w:t xml:space="preserve">Every material claim tagged [F] fact, [E] estimate, or [H] hypothesis</w:t>
+              <w:t>Every material claim tagged [F] fact, [E] estimate, or [H] hypothesis</w:t>
             </w:r>
           </w:p>
         </w:tc>
@@ -4858,11 +4532,8 @@
                 <w:rFonts w:ascii="Wix Madefor Display SemiBold" w:hAnsi="Wix Madefor Display SemiBold" w:cs="Wix Madefor Display SemiBold"/>
                 <w:b/>
                 <w:bCs/>
-                <w:color w:val="000000"/>
-                <w:sz w:val="18"/>
-                <w:szCs w:val="18"/>
               </w:rPr>
-              <w:t xml:space="preserve">KILL claims</w:t>
+              <w:t>KILL claims</w:t>
             </w:r>
           </w:p>
         </w:tc>
@@ -4885,13 +4556,7 @@
           </w:tcPr>
           <w:p>
             <w:r>
-              <w:rPr>
-                <w:rFonts w:ascii="Wix Madefor Display" w:hAnsi="Wix Madefor Display" w:cs="Wix Madefor Display"/>
-                <w:color w:val="000000"/>
-                <w:sz w:val="18"/>
-                <w:szCs w:val="18"/>
-              </w:rPr>
-              <w:t xml:space="preserve">All KILL-rated claims from red-team must be hardened before Phase 6</w:t>
+              <w:t>All KILL-rated claims from red-team must be hardened before Phase 6</w:t>
             </w:r>
           </w:p>
         </w:tc>
@@ -4920,11 +4585,8 @@
                 <w:rFonts w:ascii="Wix Madefor Display SemiBold" w:hAnsi="Wix Madefor Display SemiBold" w:cs="Wix Madefor Display SemiBold"/>
                 <w:b/>
                 <w:bCs/>
-                <w:color w:val="000000"/>
-                <w:sz w:val="18"/>
-                <w:szCs w:val="18"/>
               </w:rPr>
-              <w:t xml:space="preserve">QC gate</w:t>
+              <w:t>QC gate</w:t>
             </w:r>
           </w:p>
         </w:tc>
@@ -4947,13 +4609,13 @@
           </w:tcPr>
           <w:p>
             <w:r>
-              <w:rPr>
-                <w:rFonts w:ascii="Wix Madefor Display" w:hAnsi="Wix Madefor Display" w:cs="Wix Madefor Display"/>
-                <w:color w:val="000000"/>
-                <w:sz w:val="18"/>
-                <w:szCs w:val="18"/>
-              </w:rPr>
-              <w:t xml:space="preserve">Zero 🔴 CRITICAL doc-quality-checker issues before IC distribution</w:t>
+              <w:t xml:space="preserve">Zero </w:t>
+            </w:r>
+            <w:r>
+              <w:t>🔴</w:t>
+            </w:r>
+            <w:r>
+              <w:t xml:space="preserve"> CRITICAL doc-quality-checker issues before IC distribution</w:t>
             </w:r>
           </w:p>
         </w:tc>
@@ -4982,11 +4644,8 @@
                 <w:rFonts w:ascii="Wix Madefor Display SemiBold" w:hAnsi="Wix Madefor Display SemiBold" w:cs="Wix Madefor Display SemiBold"/>
                 <w:b/>
                 <w:bCs/>
-                <w:color w:val="000000"/>
-                <w:sz w:val="18"/>
-                <w:szCs w:val="18"/>
               </w:rPr>
-              <w:t xml:space="preserve">Distribution</w:t>
+              <w:t>Distribution</w:t>
             </w:r>
           </w:p>
         </w:tc>
@@ -5009,13 +4668,7 @@
           </w:tcPr>
           <w:p>
             <w:r>
-              <w:rPr>
-                <w:rFonts w:ascii="Wix Madefor Display" w:hAnsi="Wix Madefor Display" w:cs="Wix Madefor Display"/>
-                <w:color w:val="000000"/>
-                <w:sz w:val="18"/>
-                <w:szCs w:val="18"/>
-              </w:rPr>
-              <w:t xml:space="preserve">Never publish — IC distribution requires senior sign-off outside this agent</w:t>
+              <w:t>Never publish — IC distribution requires senior sign-off outside this agent</w:t>
             </w:r>
           </w:p>
         </w:tc>
@@ -5044,11 +4697,8 @@
                 <w:rFonts w:ascii="Wix Madefor Display SemiBold" w:hAnsi="Wix Madefor Display SemiBold" w:cs="Wix Madefor Display SemiBold"/>
                 <w:b/>
                 <w:bCs/>
-                <w:color w:val="000000"/>
-                <w:sz w:val="18"/>
-                <w:szCs w:val="18"/>
               </w:rPr>
-              <w:t xml:space="preserve">MOIC sum</w:t>
+              <w:t>MOIC sum</w:t>
             </w:r>
           </w:p>
         </w:tc>
@@ -5071,18 +4721,13 @@
           </w:tcPr>
           <w:p>
             <w:r>
-              <w:rPr>
-                <w:rFonts w:ascii="Wix Madefor Display" w:hAnsi="Wix Madefor Display" w:cs="Wix Madefor Display"/>
-                <w:color w:val="000000"/>
-                <w:sz w:val="18"/>
-                <w:szCs w:val="18"/>
-              </w:rPr>
-              <w:t xml:space="preserve">NTB MOIC contributions must sum within ±15% tolerance (ntb-diligence enforces this)</w:t>
+              <w:t>NTB MOIC contributions must sum within ±15% tolerance (ntb-diligence enforces this)</w:t>
             </w:r>
           </w:p>
         </w:tc>
       </w:tr>
     </w:tbl>
+    <w:p/>
     <w:sectPr>
       <w:headerReference w:type="even" r:id="rId7"/>
       <w:headerReference w:type="default" r:id="rId8"/>
@@ -5447,7 +5092,43 @@
         <w:sz w:val="22"/>
         <w:szCs w:val="24"/>
       </w:rPr>
-      <w:t>Deal Intelligence  |  Workflow Reference  |  May 2026</w:t>
+      <w:t xml:space="preserve">Deal </w:t>
+    </w:r>
+    <w:proofErr w:type="gramStart"/>
+    <w:r>
+      <w:rPr>
+        <w:rFonts w:ascii="Wix Madefor Display SemiBold" w:hAnsi="Wix Madefor Display SemiBold"/>
+        <w:sz w:val="22"/>
+        <w:szCs w:val="24"/>
+      </w:rPr>
+      <w:t>Intelligence  |</w:t>
+    </w:r>
+    <w:proofErr w:type="gramEnd"/>
+    <w:r>
+      <w:rPr>
+        <w:rFonts w:ascii="Wix Madefor Display SemiBold" w:hAnsi="Wix Madefor Display SemiBold"/>
+        <w:sz w:val="22"/>
+        <w:szCs w:val="24"/>
+      </w:rPr>
+      <w:t xml:space="preserve">  Workflow </w:t>
+    </w:r>
+    <w:proofErr w:type="gramStart"/>
+    <w:r>
+      <w:rPr>
+        <w:rFonts w:ascii="Wix Madefor Display SemiBold" w:hAnsi="Wix Madefor Display SemiBold"/>
+        <w:sz w:val="22"/>
+        <w:szCs w:val="24"/>
+      </w:rPr>
+      <w:t>Reference  |</w:t>
+    </w:r>
+    <w:proofErr w:type="gramEnd"/>
+    <w:r>
+      <w:rPr>
+        <w:rFonts w:ascii="Wix Madefor Display SemiBold" w:hAnsi="Wix Madefor Display SemiBold"/>
+        <w:sz w:val="22"/>
+        <w:szCs w:val="24"/>
+      </w:rPr>
+      <w:t xml:space="preserve">  May 2026</w:t>
     </w:r>
     <w:r>
       <w:rPr>
@@ -5588,7 +5269,7 @@
         <w:sz w:val="20"/>
       </w:rPr>
     </w:lvl>
-    <w:lvl w:ilvl="1" w:tentative="1">
+    <w:lvl w:ilvl="1">
       <w:start w:val="1"/>
       <w:numFmt w:val="bullet"/>
       <w:lvlText w:val="o"/>

</xml_diff>